<commit_message>
Reviewer edits, cap compliance, budget/biosketch/plan must-fixes, gated web page
- Best-form reviewer edits (red), corrected [1] sweep claim, compressed Figure 1
- Research Plan trimmed to 5 pages; Biosketch 2 pages; Budget 1 page (all caps met)
- Budget rebuilt: personnel FTE, cloud compute (all local equipment moved to cloud),
  real-data acquisition, provisional patent; total 350,000 NIS
- Biosketch reframed around basic research; Contributions to Science block
- Plan: demonstrator nouns, measurable gates G1/G2/G3, real-data task, IP timing
- No-partner reframe (validation via public + field data)
- index.html: gated web version (client-side password) with DOCX download badge

Co-Authored-By: Claude Opus 4.8 <noreply@anthropic.com>
</commit_message>
<xml_diff>
--- a/Application-2026-ReSight-YehuditAperstein_v3.docx
+++ b/Application-2026-ReSight-YehuditAperstein_v3.docx
@@ -2957,7 +2957,7 @@
           <w:sz w:val="22"/>
           <w:szCs w:val="22"/>
         </w:rPr>
-        <w:t xml:space="preserve">Privacy and regulatory (proposed): </w:t>
+        <w:t xml:space="preserve">Privacy and regulatory: </w:t>
       </w:r>
       <w:r>
         <w:rPr>
@@ -3921,7 +3921,7 @@
           <w:sz w:val="22"/>
           <w:szCs w:val="22"/>
         </w:rPr>
-        <w:t xml:space="preserve">Proposed team additions:</w:t>
+        <w:t xml:space="preserve">Research team:</w:t>
       </w:r>
     </w:p>
     <w:p>
@@ -4793,9 +4793,11 @@
                 <w:r>
                   <w:rPr>
                     <w:rFonts w:ascii="Times New Roman" w:hAnsi="Times New Roman" w:cs="Times New Roman"/>
-                    <w:color w:val="000000"/>
+                    <w:color w:val="C00000"/>
+                    <w:sz w:val="22"/>
+                    <w:szCs w:val="22"/>
                   </w:rPr>
-                  <w:t>Modern cities are full of visual sensors that were installed and tuned for specific tasks. Face-recognition cameras are positioned for access control, license-plate cameras for vehicle identification, traffic cameras for flow monitoring, dashboard cameras for insurance evidence, ATM cameras for security, and citizen-uploaded videos for reporting a local incident. Yet each of these sources also captures many other details about the surrounding world. A dashboard camera may capture a damaged road sign. An ATM camera may capture a nearby vehicle. A citizen video may contain evidence of flooding, crowding, smoke, infrastructure damage, or unsafe traffic behavior. Although these sensors and their supporting infrastructure involve significant cost, their practical value is usually limited to a single application.</w:t>
+                  <w:t xml:space="preserve">Cities are full of visual sensors installed for one task: face recognition for access, LPR for vehicles, traffic cameras for flow, dashcams for insurance, ATM cameras for security, citizen videos for incident reports. Each also captures much more: a dashcam catches a damaged sign, an ATM camera a nearby vehicle, a citizen clip flooding, smoke, crowding, or unsafe traffic. This costly infrastructure is usually used for only one application.</w:t>
                 </w:r>
               </w:p>
               <w:p>
@@ -4807,23 +4809,11 @@
                 <w:r>
                   <w:rPr>
                     <w:rFonts w:ascii="Times New Roman" w:hAnsi="Times New Roman" w:cs="Times New Roman"/>
-                    <w:color w:val="000000"/>
+                    <w:color w:val="C00000"/>
+                    <w:sz w:val="22"/>
+                    <w:szCs w:val="22"/>
                   </w:rPr>
-                  <w:t>The problem is that this secondary information is often difficult to use. The camera was not placed for the new task, so the object of interest may be extremely distorted: small, oblique, warped, noisy, blurred, compressed, partly occluded, poorly illuminated, motion-smeared, outside the best field of view, or extremely dewarped after geometric correction. In many cases, the useful signal is difficult for the human eye. Modern AI models can now extract rich, useful information from such difficult visual material, but operational users still need a system that can turn scattered, imperfect footage into actionable insight</w:t>
-                </w:r>
-                <w:r>
-                  <w:rPr>
-                    <w:rFonts w:ascii="Times New Roman" w:hAnsi="Times New Roman" w:cs="Times New Roman"/>
-                    <w:color w:val="000000"/>
-                  </w:rPr>
-                  <w:t xml:space="preserve"> </w:t>
-                </w:r>
-                <w:r>
-                  <w:rPr>
-                    <w:rFonts w:ascii="Times New Roman" w:hAnsi="Times New Roman" w:cs="Times New Roman"/>
-                    <w:color w:val="000000"/>
-                  </w:rPr>
-                  <w:t>while determining when the extracted information is sufficiently reliable for operational use.</w:t>
+                  <w:t xml:space="preserve">This secondary information is hard to use. The camera was not placed for the new task, so the object may be small, oblique, warped, noisy, blurred, compressed, occluded, poorly lit, or motion-smeared, often past what the human eye can read. AI can now extract information from such material, but operators still need a system that turns scattered, imperfect footage into actionable insight and knows when it is reliable enough to act on.</w:t>
                 </w:r>
               </w:p>
               <w:p>
@@ -4835,65 +4825,11 @@
                 <w:r>
                   <w:rPr>
                     <w:rFonts w:ascii="Times New Roman" w:hAnsi="Times New Roman" w:cs="Times New Roman"/>
-                    <w:color w:val="000000"/>
+                    <w:color w:val="C00000"/>
+                    <w:sz w:val="22"/>
+                    <w:szCs w:val="22"/>
                   </w:rPr>
-                  <w:t xml:space="preserve">ReSight uses AI to convert difficult visual material into structured operational outputs and connect them to decisions such as alerts, triage, prioritization, and follow-up review. Its key differentiator is the opportunistic sensing approach: instead of requiring new dedicated sensors for every task, the system turns scattered visual evidence into reusable </w:t>
-                </w:r>
-                <w:r>
-                  <w:rPr>
-                    <w:rFonts w:ascii="Times New Roman" w:hAnsi="Times New Roman" w:cs="Times New Roman"/>
-                    <w:color w:val="000000"/>
-                  </w:rPr>
-                  <w:t>intelligence</w:t>
-                </w:r>
-                <w:r>
-                  <w:rPr>
-                    <w:rFonts w:ascii="Times New Roman" w:hAnsi="Times New Roman" w:cs="Times New Roman"/>
-                    <w:color w:val="000000"/>
-                  </w:rPr>
-                  <w:t xml:space="preserve"> [</w:t>
-                </w:r>
-                <w:r>
-                  <w:rPr>
-                    <w:rFonts w:ascii="Times New Roman" w:hAnsi="Times New Roman" w:cs="Times New Roman"/>
-                    <w:color w:val="000000"/>
-                  </w:rPr>
-                  <w:t>2,3</w:t>
-                </w:r>
-                <w:r>
-                  <w:rPr>
-                    <w:rFonts w:ascii="Times New Roman" w:hAnsi="Times New Roman" w:cs="Times New Roman"/>
-                    <w:color w:val="000000"/>
-                  </w:rPr>
-                  <w:t>]</w:t>
-                </w:r>
-                <w:r>
-                  <w:rPr>
-                    <w:rFonts w:ascii="Times New Roman" w:hAnsi="Times New Roman" w:cs="Times New Roman"/>
-                    <w:color w:val="000000"/>
-                  </w:rPr>
-                  <w:t>, substantially</w:t>
-                </w:r>
-                <w:r>
-                  <w:rPr>
-                    <w:rFonts w:ascii="Times New Roman" w:hAnsi="Times New Roman" w:cs="Times New Roman"/>
-                    <w:color w:val="000000"/>
-                  </w:rPr>
-                  <w:t xml:space="preserve"> increasing the return on investment from existing sensing infrastructure.</w:t>
-                </w:r>
-                <w:r>
-                  <w:rPr>
-                    <w:rFonts w:ascii="Times New Roman" w:hAnsi="Times New Roman" w:cs="Times New Roman"/>
-                    <w:color w:val="000000"/>
-                  </w:rPr>
-                  <w:t xml:space="preserve"> </w:t>
-                </w:r>
-                <w:r>
-                  <w:rPr>
-                    <w:rFonts w:ascii="Times New Roman" w:hAnsi="Times New Roman" w:cs="Times New Roman"/>
-                    <w:color w:val="000000"/>
-                  </w:rPr>
-                  <w:t>The proposed POC will test whether these capabilities can be integrated into a reusable operational engine.</w:t>
+                  <w:t xml:space="preserve">ReSight converts difficult visual material into structured outputs and connects them to decisions such as alerts, triage, prioritization, and review. Its differentiator is opportunistic sensing [2,3]: instead of new dedicated sensors per task, it turns scattered visual evidence into reusable intelligence, raising the return on existing infrastructure. The POC tests whether these capabilities integrate into one reusable engine.</w:t>
                 </w:r>
               </w:p>
               <w:p>
@@ -4902,69 +4838,21 @@
                   <w:ind w:firstLine="720"/>
                   <w:jc w:val="both"/>
                 </w:pPr>
-                <w:r>
-                  <w:rPr>
-                    <w:rFonts w:ascii="Times New Roman" w:hAnsi="Times New Roman" w:cs="Times New Roman"/>
-                    <w:color w:val="000000"/>
-                  </w:rPr>
-                  <w:t>Current market data shows a large sunk-cost opportunity. The global video-surveillance market was estimated at USD 53.57B in 2024 and is projected to reach USD 88.06B by 2031; hardware accounted for 61.8% of the market in 2024 [</w:t>
-                </w:r>
-                <w:r>
-                  <w:rPr>
-                    <w:rFonts w:ascii="Times New Roman" w:hAnsi="Times New Roman" w:cs="Times New Roman"/>
-                    <w:color w:val="000000"/>
-                  </w:rPr>
-                  <w:t>4</w:t>
-                </w:r>
-                <w:r>
-                  <w:rPr>
-                    <w:rFonts w:ascii="Times New Roman" w:hAnsi="Times New Roman" w:cs="Times New Roman"/>
-                    <w:color w:val="000000"/>
-                  </w:rPr>
-                  <w:t>]. The global smart-cities market was estimated at USD 615.7B in 2024 and is projected to reach USD 1,445.6B by 2030 [</w:t>
-                </w:r>
-                <w:r>
-                  <w:rPr>
-                    <w:rFonts w:ascii="Times New Roman" w:hAnsi="Times New Roman" w:cs="Times New Roman"/>
-                    <w:color w:val="000000"/>
-                  </w:rPr>
-                  <w:t>5</w:t>
-                </w:r>
-                <w:r>
-                  <w:rPr>
-                    <w:rFonts w:ascii="Times New Roman" w:hAnsi="Times New Roman" w:cs="Times New Roman"/>
-                    <w:color w:val="000000"/>
-                  </w:rPr>
-                  <w:t>]. These figures indicate that cities, security operators, and infrastructure owners are already investing heavily in cameras, storage, connectivity, command centers, and related digital infrastructure.</w:t>
-                </w:r>
-              </w:p>
-              <w:p>
-                <w:pPr>
-                  <w:spacing w:line="360" w:lineRule="auto"/>
-                  <w:ind w:firstLine="720"/>
-                  <w:jc w:val="both"/>
-                </w:pPr>
-                <w:r>
-                  <w:rPr>
-                    <w:rFonts w:ascii="Times New Roman" w:hAnsi="Times New Roman" w:cs="Times New Roman"/>
-                    <w:color w:val="000000"/>
-                  </w:rPr>
-                  <w:t>The analytics layer is growing even faster. The global video-analytics market was estimated at USD 12.71B in 2024 and is projected to reach USD 37.84B by 2030, while AI video analytics for smart cities alone is projected to grow from USD 8.50B in 2025 to USD 28.76B by 2030 [</w:t>
-                </w:r>
-                <w:r>
-                  <w:rPr>
-                    <w:rFonts w:ascii="Times New Roman" w:hAnsi="Times New Roman" w:cs="Times New Roman"/>
-                    <w:color w:val="000000"/>
-                  </w:rPr>
-                  <w:t>6,7</w:t>
-                </w:r>
-                <w:r>
-                  <w:rPr>
-                    <w:rFonts w:ascii="Times New Roman" w:hAnsi="Times New Roman" w:cs="Times New Roman"/>
-                    <w:color w:val="000000"/>
-                  </w:rPr>
-                  <w:t>]. ReSight targets the economic gap between these two facts: visual infrastructure is already installed and paid for, while additional AI value depends on reusing that same base for more than one task.</w:t>
-                </w:r>
+                <w:p>
+                  <w:pPr>
+                    <w:spacing w:line="360" w:lineRule="auto"/>
+                    <w:jc w:val="both"/>
+                  </w:pPr>
+                  <w:r>
+                    <w:rPr>
+                      <w:rFonts w:ascii="Times New Roman" w:hAnsi="Times New Roman" w:cs="Times New Roman"/>
+                      <w:color w:val="C00000"/>
+                      <w:sz w:val="22"/>
+                      <w:szCs w:val="22"/>
+                    </w:rPr>
+                    <w:t xml:space="preserve">The opportunity is large and already funded: the global video-surveillance market was USD 53.57B in 2024 (61.8% hardware), heading to USD 88.06B by 2031, and smart cities USD 615.7B heading to USD 1,445.6B by 2030 [4,5]. The analytics layer grows faster, from USD 12.71B (2024) to USD 37.84B by 2030, with AI video analytics for smart cities reaching USD 28.76B by 2030 [6,7]. ReSight targets the gap: additional AI value depends on reusing that installed, already-paid-for base for more than one task.</w:t>
+                  </w:r>
+                </w:p>
               </w:p>
               <w:p>
                 <w:pPr>
@@ -5005,9 +4893,11 @@
                 <w:r>
                   <w:rPr>
                     <w:rFonts w:ascii="Times New Roman" w:hAnsi="Times New Roman" w:cs="Times New Roman"/>
-                    <w:color w:val="000000"/>
+                    <w:color w:val="C00000"/>
+                    <w:sz w:val="22"/>
+                    <w:szCs w:val="22"/>
                   </w:rPr>
-                  <w:t>The objective is to build the ReSight core engine: a reusable AI-driven opportunistic sensing engine that extracts useful insights from available visual sources. The technology builds on recent work by the PI and collaborators on recovering visual information under extreme viewing angles [1]. The engine will accept a defined operational task and a class of sources, ingest or simulate relevant footage, run restoration and analytics models, extract structured findings, calculate reliability metrics, and provide actionable insights for operational use.</w:t>
+                  <w:t xml:space="preserve">The objective is the ReSight core engine: a reusable, AI-driven opportunistic-sensing engine built on the PI's work on recovering visual information under extreme viewing angles [1]. Given an operational task and a class of sources, it ingests or simulates footage, runs restoration and analytics, extracts structured findings, computes reliability metrics, and returns actionable insight.</w:t>
                 </w:r>
               </w:p>
               <w:p>
@@ -5021,7 +4911,7 @@
                   </w:rPr>
                   <w:drawing>
                     <wp:inline distT="0" distB="0" distL="0" distR="0" wp14:anchorId="02D61E6B" wp14:editId="2167D70A">
-                      <wp:extent cx="3352800" cy="1676400"/>
+                      <wp:extent cx="2076054" cy="1038027"/>
                       <wp:effectExtent l="0" t="0" r="0" b="0"/>
                       <wp:docPr id="1" name="Picture 1"/>
                       <wp:cNvGraphicFramePr>
@@ -5043,7 +4933,7 @@
                             <pic:spPr>
                               <a:xfrm>
                                 <a:off x="0" y="0"/>
-                                <a:ext cx="3364515" cy="1682258"/>
+                                <a:ext cx="2083308" cy="1041654"/>
                               </a:xfrm>
                               <a:prstGeom prst="rect">
                                 <a:avLst/>
@@ -5083,34 +4973,6 @@
               <w:p>
                 <w:pPr>
                   <w:spacing w:line="360" w:lineRule="auto"/>
-                  <w:ind w:firstLine="720"/>
-                  <w:jc w:val="both"/>
-                </w:pPr>
-                <w:r>
-                  <w:rPr>
-                    <w:rFonts w:ascii="Times New Roman" w:hAnsi="Times New Roman" w:cs="Times New Roman"/>
-                    <w:color w:val="000000"/>
-                  </w:rPr>
-                  <w:t xml:space="preserve">The first demonstrator will focus on </w:t>
-                </w:r>
-                <w:r>
-                  <w:rPr>
-                    <w:rFonts w:ascii="Times New Roman" w:hAnsi="Times New Roman" w:cs="Times New Roman"/>
-                    <w:color w:val="000000"/>
-                  </w:rPr>
-                  <w:t>a bounded vehicle and road-scene scenario under difficult viewing conditions, anchored in license-plate recovery and complemented by a road-scene analytics task.</w:t>
-                </w:r>
-                <w:r>
-                  <w:rPr>
-                    <w:rFonts w:ascii="Times New Roman" w:hAnsi="Times New Roman" w:cs="Times New Roman"/>
-                    <w:color w:val="000000"/>
-                  </w:rPr>
-                  <w:t xml:space="preserve"> The license-plate component is scientifically grounded in the existing paper on recoverability under extreme viewing angles. The core engine, however, will be designed for additional smart-city, surveillance, and defense tasks, such as infrastructure condition monitoring, traffic-incident awareness, crowd-density estimation, emergency-signal detection, and perimeter situational awareness.</w:t>
-                </w:r>
-              </w:p>
-              <w:p>
-                <w:pPr>
-                  <w:spacing w:line="360" w:lineRule="auto"/>
                   <w:jc w:val="both"/>
                 </w:pPr>
                 <w:r>
@@ -5122,7 +4984,7 @@
                     <w:sz w:val="22"/>
                     <w:szCs w:val="22"/>
                   </w:rPr>
-                  <w:t xml:space="preserve">Bounded demonstrator (proposed refinement): </w:t>
+                  <w:t xml:space="preserve"/>
                 </w:r>
                 <w:r>
                   <w:rPr>
@@ -5162,16 +5024,11 @@
                 <w:r>
                   <w:rPr>
                     <w:rFonts w:ascii="Times New Roman" w:hAnsi="Times New Roman" w:cs="Times New Roman"/>
-                    <w:color w:val="000000"/>
+                    <w:color w:val="C00000"/>
+                    <w:sz w:val="22"/>
+                    <w:szCs w:val="22"/>
                   </w:rPr>
-                  <w:t>The market includes license-plate recognition systems, video-management systems, smart-city analytics platforms, forensic video tools, and AI image-enhancement products. These products are valuable, but most are built around purpose-installed sensor arrays</w:t>
-                </w:r>
-                <w:r>
-                  <w:rPr>
-                    <w:rFonts w:ascii="Times New Roman" w:hAnsi="Times New Roman" w:cs="Times New Roman"/>
-                    <w:color w:val="000000"/>
-                  </w:rPr>
-                  <w:t>: the camera, lens, height, angle, illumination, lane coverage, field of view, and analytics model are selected together for a known operational regime. The analytics are then designed to work within these engineered limits, not to repurpose uncontrolled footage from cameras installed for other reasons.</w:t>
+                  <w:t xml:space="preserve">Existing products (LPR systems, video-management systems, smart-city analytics, forensic video tools, AI image enhancement) are valuable but built around purpose-installed sensor arrays: camera, lens, height, angle, illumination, and field of view are chosen together for a known regime, and the analytics assume those engineered limits rather than repurposing uncontrolled footage.</w:t>
                 </w:r>
               </w:p>
               <w:p>
@@ -5183,66 +5040,11 @@
                 <w:r>
                   <w:rPr>
                     <w:rFonts w:ascii="Times New Roman" w:hAnsi="Times New Roman" w:cs="Times New Roman"/>
-                    <w:color w:val="000000"/>
+                    <w:color w:val="C00000"/>
+                    <w:sz w:val="22"/>
+                    <w:szCs w:val="22"/>
                   </w:rPr>
-                  <w:t>Typical LPR deployments illustrate this limitation</w:t>
-                </w:r>
-                <w:r>
-                  <w:rPr>
-                    <w:rFonts w:ascii="Times New Roman" w:hAnsi="Times New Roman" w:cs="Times New Roman"/>
-                    <w:color w:val="000000"/>
-                  </w:rPr>
-                  <w:t xml:space="preserve"> [</w:t>
-                </w:r>
-                <w:r>
-                  <w:rPr>
-                    <w:rFonts w:ascii="Times New Roman" w:hAnsi="Times New Roman" w:cs="Times New Roman"/>
-                    <w:color w:val="000000"/>
-                  </w:rPr>
-                  <w:t>8</w:t>
-                </w:r>
-                <w:r>
-                  <w:rPr>
-                    <w:rFonts w:ascii="Times New Roman" w:hAnsi="Times New Roman" w:cs="Times New Roman"/>
-                    <w:color w:val="000000"/>
-                  </w:rPr>
-                  <w:t>]</w:t>
-                </w:r>
-                <w:r>
-                  <w:rPr>
-                    <w:rFonts w:ascii="Times New Roman" w:hAnsi="Times New Roman" w:cs="Times New Roman"/>
-                    <w:color w:val="000000"/>
-                  </w:rPr>
-                  <w:t>. Axis recommends keeping both horizontal and vertical angles below 30 degrees and placing the capture point at about twice the mounting height; VIVOTEK guidance recommends vertical angle within 30 degrees, horizontal angle within 20 degrees, 15 to 30 meters between camera and reading point for roadside installations, and no more than two lanes per camera [</w:t>
-                </w:r>
-                <w:r>
-                  <w:rPr>
-                    <w:rFonts w:ascii="Times New Roman" w:hAnsi="Times New Roman" w:cs="Times New Roman"/>
-                    <w:color w:val="000000"/>
-                  </w:rPr>
-                  <w:t>9,10</w:t>
-                </w:r>
-                <w:r>
-                  <w:rPr>
-                    <w:rFonts w:ascii="Times New Roman" w:hAnsi="Times New Roman" w:cs="Times New Roman"/>
-                    <w:color w:val="000000"/>
-                  </w:rPr>
-                  <w:t>]. These ranges are appropriate for dedicated LPR infrastructure</w:t>
-                </w:r>
-                <w:r>
-                  <w:rPr>
-                    <w:rFonts w:ascii="Times New Roman" w:hAnsi="Times New Roman" w:cs="Times New Roman"/>
-                    <w:color w:val="000000"/>
-                  </w:rPr>
-                  <w:t xml:space="preserve">, but they do not describe the opportunistic regime in which an ATM camera, dashboard video, body camera, road camera, or citizen-uploaded clip may capture the relevant object from a difficult, distorted, or partial viewpoint. In contrast, the </w:t>
-                </w:r>
-                <w:r>
-                  <w:rPr>
-                    <w:rFonts w:ascii="Times New Roman" w:hAnsi="Times New Roman" w:cs="Times New Roman"/>
-                    <w:color w:val="000000"/>
-                  </w:rPr>
-                  <w:lastRenderedPageBreak/>
-                  <w:t>PI's recent research shows that AI-based recovery can read license plates even under extreme viewing angles above 80 degrees in the studied benchmark setting [1].</w:t>
+                  <w:t xml:space="preserve">Vendor LPR guidance illustrates this [8]: Axis advises horizontal and vertical angles below 30 degrees and a capture point at about twice the mounting height; VIVOTEK advises vertical within 30 degrees, horizontal within 20 degrees, 15 to 30 m range, and at most two lanes [9,10]. These suit dedicated LPR, not the opportunistic regime where an ATM, dashcam, body-cam, or citizen clip captures the object from a difficult, partial viewpoint. By contrast, [1] shows AI recovery reads plates even beyond 80 degrees in the benchmark.</w:t>
                 </w:r>
               </w:p>
               <w:p>
@@ -5254,23 +5056,11 @@
                 <w:r>
                   <w:rPr>
                     <w:rFonts w:ascii="Times New Roman" w:hAnsi="Times New Roman" w:cs="Times New Roman"/>
-                    <w:color w:val="000000"/>
+                    <w:color w:val="C00000"/>
+                    <w:sz w:val="22"/>
+                    <w:szCs w:val="22"/>
                   </w:rPr>
-                  <w:t xml:space="preserve">In contrast to purpose-installed systems that are optimized for a known operational regime, ReSight is designed for the uncontrolled regime of existing cameras, video platforms, citizen-report channels, and field media. It extracts actionable findings from heterogeneous sources, determines when the media supports the task, identifies </w:t>
-                </w:r>
-                <w:r>
-                  <w:rPr>
-                    <w:rFonts w:ascii="Times New Roman" w:hAnsi="Times New Roman" w:cs="Times New Roman"/>
-                    <w:color w:val="000000"/>
-                  </w:rPr>
-                  <w:t>unreliable operating conditions, and routes uncertain cases to human review</w:t>
-                </w:r>
-                <w:r>
-                  <w:rPr>
-                    <w:rFonts w:ascii="Times New Roman" w:hAnsi="Times New Roman" w:cs="Times New Roman"/>
-                    <w:color w:val="000000"/>
-                  </w:rPr>
-                  <w:t>. The financial logic is direct: cameras, connectivity, storage, and visual workflows are already installed and already paid for; ReSight increases the return on that installed base by enabling multiple additional applications on top of the same sensors. This creates a clear commercial path for municipalities, defense and homeland-security integrators, transportation operators, parking operators, emergency centers, and companies building analytics on top of existing visual data.</w:t>
+                  <w:t xml:space="preserve">ReSight is built for the uncontrolled regime of existing cameras, video platforms, citizen channels, and field media: it extracts findings from heterogeneous sources, decides when the media supports the task, flags unreliable conditions, and routes uncertain cases to human review. Because the cameras, connectivity, and storage are already paid for, ReSight raises the return on that installed base, creating a commercial path for municipalities, security and homeland-security integrators, transport and parking operators, emergency centers, and analytics vendors.</w:t>
                 </w:r>
               </w:p>
               <w:p>
@@ -5287,7 +5077,7 @@
                     <w:sz w:val="22"/>
                     <w:szCs w:val="22"/>
                   </w:rPr>
-                  <w:t xml:space="preserve">Technical competition (proposed addition): </w:t>
+                  <w:t xml:space="preserve">Technical competition: </w:t>
                 </w:r>
                 <w:r>
                   <w:rPr>
@@ -5296,7 +5086,7 @@
                     <w:sz w:val="22"/>
                     <w:szCs w:val="22"/>
                   </w:rPr>
-                  <w:t xml:space="preserve">The relevant competitors are image-restoration models (Restormer [11], diffusion-based restorers), forensic enhancement tools (for example Amped FIVE), and multi-task scene-understanding APIs (for example AWS Rekognition, Azure Video Indexer). These improve or interpret imagery, but none reports where in the acquisition space its output is trustworthy, and none routes low-reliability cases to human review. ReSight’s contribution is exactly this trust-aware, reuse-oriented layer on top of restoration and analytics.</w:t>
+                  <w:t xml:space="preserve">restoration models (Restormer [11], diffusion restorers), forensic tools (Amped FIVE), and scene-understanding APIs (AWS Rekognition, Azure Video Indexer) improve or interpret imagery, but none reports where in the acquisition space its output is trustworthy or routes low-reliability cases to human review; that trust-aware, reuse layer is ReSight’s contribution.</w:t>
                 </w:r>
               </w:p>
               <w:p>
@@ -5434,7 +5224,7 @@
                     <w:rFonts w:ascii="Times New Roman" w:hAnsi="Times New Roman" w:cs="Times New Roman"/>
                     <w:color w:val="000000"/>
                   </w:rPr>
-                  <w:t>An initial validation-partner and commercialization document focused on recovering additional value from existing sensors.</w:t>
+                  <w:t>An initial commercialization document focused on recovering additional value from existing sensors.</w:t>
                 </w:r>
               </w:p>
               <w:p>
@@ -5492,40 +5282,11 @@
                 <w:r>
                   <w:rPr>
                     <w:rFonts w:ascii="Times New Roman" w:hAnsi="Times New Roman" w:cs="Times New Roman"/>
-                    <w:i/>
-                    <w:iCs/>
-                    <w:color w:val="000000"/>
+                    <w:color w:val="C00000"/>
+                    <w:sz w:val="22"/>
+                    <w:szCs w:val="22"/>
                   </w:rPr>
-                  <w:t>Proposed milestones</w:t>
-                </w:r>
-                <w:r>
-                  <w:rPr>
-                    <w:rFonts w:ascii="Times New Roman" w:hAnsi="Times New Roman" w:cs="Times New Roman"/>
-                    <w:color w:val="000000"/>
-                  </w:rPr>
-                  <w:t>: Months 1 to 4, define use cases, validation requirements, source types, insight schema, and evaluation metrics. Months 5 to 10, implement the synthetic scenario generator and baseline analytics pipeline. Months 11 to 16, implement insight extraction, reliability scoring, model comparison, and uncertainty routing. Months 17 to 20, validate the core engine on a realistic smart-city, surveillance, or defense scenario with feedback from engaged validation partners. Months 21 to 24, finalize the engine package, intellectual-property plan, and commercialization roadmap.</w:t>
-                </w:r>
-              </w:p>
-              <w:p>
-                <w:pPr>
-                  <w:spacing w:line="360" w:lineRule="auto"/>
-                  <w:ind w:firstLine="720"/>
-                </w:pPr>
-                <w:r>
-                  <w:rPr>
-                    <w:rFonts w:ascii="Times New Roman" w:hAnsi="Times New Roman" w:cs="Times New Roman"/>
-                    <w:i/>
-                    <w:iCs/>
-                    <w:color w:val="000000"/>
-                  </w:rPr>
-                  <w:t>Success metrics</w:t>
-                </w:r>
-                <w:r>
-                  <w:rPr>
-                    <w:rFonts w:ascii="Times New Roman" w:hAnsi="Times New Roman" w:cs="Times New Roman"/>
-                    <w:color w:val="000000"/>
-                  </w:rPr>
-                  <w:t>: accuracy of extracted insights within reliable regions, coverage of the operational parameter space, stability of the reliability score, detection of failure regions, reduction in manual triage load, agreement with limited real or field-like validation, runtime for recommendation generation, and clarity of recommendations for an operational user.</w:t>
+                  <w:t xml:space="preserve">Proposed milestones: M1 to M4, define use cases, source types, the plate insight schema, and evaluation metrics, and begin real-data acquisition. M5 to M10, build the off-regime plate scenario generator (azimuth, elevation, distance, blur, illumination) and the plate restoration plus OCR baseline. M11 to M16, add the recoverability-based reliability scorer, model comparison, and human-review routing, with an invention disclosure at M12 and a provisional patent filed by M16. M17 to M20, validate on a realistic scenario using public and permitted field data. M21 to M24, finalize the engine, commercialization roadmap, and final report.</w:t>
                 </w:r>
               </w:p>
               <w:p>
@@ -5542,7 +5303,7 @@
                     <w:sz w:val="22"/>
                     <w:szCs w:val="22"/>
                   </w:rPr>
-                  <w:t xml:space="preserve">Success metrics (proposed targets, anchored to [1]): </w:t>
+                  <w:t xml:space="preserve">Success metrics: </w:t>
                 </w:r>
                 <w:r>
                   <w:rPr>
@@ -5551,7 +5312,7 @@
                     <w:sz w:val="22"/>
                     <w:szCs w:val="22"/>
                   </w:rPr>
-                  <w:t xml:space="preserve">(1) recovery keeps at least 90% of the defined viewing-angle space above the T=0.9 recoverability threshold, versus degraded input that is unrecoverable beyond roughly 60 to 70 degrees; (2) on held-out real data, restoration lifts extreme-angle whole-plate exact match by at least 15 points over the degraded baseline (cf. +15 to +38 points in [1]); (3) the reliability layer reaches boundary-AUC at least 0.92 with interior-failure score F at most 0.2, matching the discriminative cluster in [1]; (4) at least 40% reduction in items routed to human review at a false-accept rate at most 1%; (5) end-to-end inference under about 50 ms per frame (about 20 fps) per stream on a single cloud GPU, with the restoration stage at 8 to 22 ms as in [1].</w:t>
+                  <w:t xml:space="preserve">at least 90% of the target viewing-angle space (azimuth 0 to 70 degrees, elevation 0 to 45 degrees, in 5-degree cells) kept above the T=0.9 recoverability threshold; at least +15 whole-plate exact-match points on held-out real data over the degraded baseline; a reliability layer with boundary-AUC at least 0.92 and interior-failure score F (RMS distance of unrecovered interior cells to the boundary) at most 0.2; at least 40% fewer items sent to human review at a false-accept rate at most 1%; mean end-to-end latency under 50 ms per frame on one L4 GPU (restoration 8 to 22 ms as in [1]) at 8 or more concurrent 10 fps streams.</w:t>
                 </w:r>
               </w:p>
               <w:p>
@@ -5583,65 +5344,11 @@
                 <w:r>
                   <w:rPr>
                     <w:rFonts w:ascii="Times New Roman" w:hAnsi="Times New Roman" w:cs="Times New Roman"/>
-                    <w:color w:val="000000"/>
+                    <w:color w:val="C00000"/>
+                    <w:sz w:val="22"/>
+                    <w:szCs w:val="22"/>
                   </w:rPr>
-                  <w:t>The scientific novelty began with a central obstacle in opportunistic sensing: models must work outside the controlled camera placement and narrow operating regimes assumed by purpose-built systems. Real training data usually reflects intended, easy-to-capture conditions, not the extreme viewpoints and degradations that appear when an existing camera is repurposed for a new task. Our prior work addressed this gap through smart synthetic augmentation, using scrambled Sobol quasi-Monte Carlo sampling to generate training examples across </w:t>
-                </w:r>
-                <w:r>
-                  <w:rPr>
-                    <w:rFonts w:ascii="Times New Roman" w:hAnsi="Times New Roman" w:cs="Times New Roman"/>
-                    <w:color w:val="C00000"/>
-                  </w:rPr>
-                  <w:t xml:space="preserve">the acquisition space swept in [1]: viewing angle, Gaussian blur, JPEG compression, colour jitter, and edge blending</w:t>
-                </w:r>
-                <w:r>
-                  <w:rPr>
-                    <w:rFonts w:ascii="Times New Roman" w:hAnsi="Times New Roman" w:cs="Times New Roman"/>
-                    <w:color w:val="000000"/>
-                  </w:rPr>
-                  <w:t xml:space="preserve">. This protocol supported purpose training of restoration models from several architecture families, including encoder-decoder, transformer-based, GAN-based, and diffusion-b</w:t>
-                </w:r>
-                <w:r>
-                  <w:rPr>
-                    <w:rFonts w:ascii="Times New Roman" w:hAnsi="Times New Roman" w:cs="Times New Roman"/>
-                    <w:color w:val="000000"/>
-                  </w:rPr>
-                  <w:t>ased approaches</w:t>
-                </w:r>
-                <w:r>
-                  <w:rPr>
-                    <w:rFonts w:ascii="Times New Roman" w:hAnsi="Times New Roman" w:cs="Times New Roman"/>
-                    <w:color w:val="000000"/>
-                  </w:rPr>
-                  <w:t xml:space="preserve"> [</w:t>
-                </w:r>
-                <w:r>
-                  <w:rPr>
-                    <w:rFonts w:ascii="Times New Roman" w:hAnsi="Times New Roman" w:cs="Times New Roman"/>
-                    <w:color w:val="000000"/>
-                  </w:rPr>
-                  <w:t>11</w:t>
-                </w:r>
-                <w:r>
-                  <w:rPr>
-                    <w:rFonts w:ascii="Times New Roman" w:hAnsi="Times New Roman" w:cs="Times New Roman"/>
-                    <w:color w:val="000000"/>
-                  </w:rPr>
-                  <w:t>]</w:t>
-                </w:r>
-                <w:r>
-                  <w:rPr>
-                    <w:rFonts w:ascii="Times New Roman" w:hAnsi="Times New Roman" w:cs="Times New Roman"/>
-                    <w:color w:val="000000"/>
-                  </w:rPr>
-                  <w:t>,</w:t>
-                </w:r>
-                <w:r>
-                  <w:rPr>
-                    <w:rFonts w:ascii="Times New Roman" w:hAnsi="Times New Roman" w:cs="Times New Roman"/>
-                    <w:color w:val="000000"/>
-                  </w:rPr>
-                  <w:t xml:space="preserve"> while exposing them to the difficult corner cases where opportunistic sensing must actually operate.</w:t>
+                  <w:t xml:space="preserve">The novelty starts from a core obstacle in opportunistic sensing: models must work outside the controlled placement and narrow regimes of purpose-built systems, where training data rarely covers the extreme viewpoints and degradations of a repurposed camera. Our prior work met this with smart synthetic augmentation, using scrambled Sobol quasi-Monte Carlo sampling across the acquisition space swept in [1] (viewing angle, Gaussian blur, JPEG compression, colour jitter, and edge blending), training restoration models from encoder-decoder, transformer, GAN, and diffusion families [11] on the corner cases where opportunistic sensing operates.</w:t>
                 </w:r>
               </w:p>
               <w:p>
@@ -5658,7 +5365,7 @@
                     <w:sz w:val="22"/>
                     <w:szCs w:val="22"/>
                   </w:rPr>
-                  <w:t xml:space="preserve">5a. Quantified basis from prior research [1] (proposed addition): </w:t>
+                  <w:t xml:space="preserve">5a. Quantified basis from prior research [1]: </w:t>
                 </w:r>
                 <w:r>
                   <w:rPr>
@@ -5667,7 +5374,7 @@
                     <w:sz w:val="22"/>
                     <w:szCs w:val="22"/>
                   </w:rPr>
-                  <w:t xml:space="preserve">In the benchmark of [1], AI restoration keeps oblique-view license plates readable across about 90 to 92% of the [0, 89] degree by [0, 89] degree viewing-angle grid at 90% or higher plate-level OCR accuracy (recoverability threshold T=0.9); recognition is near-perfect when both the lateral and elevational angles are below 70 degrees, and the recoverable region extends beyond 80 degrees on each axis, failing only in the double-extreme corner. Five restoration architectures were compared (U-Net, conditional U-Net, Restormer, Pix2Pix-GAN, and SR3 diffusion); they cluster in a narrow boundary-AUC band of 0.89 to 0.93 (best single model about 0.93, pointwise-max 0.934), while the reliability score F separates uniformly-capable discriminative models (F about 0.09 to 0.21) from a generative model with large interior failure pockets (F up to 1.12). On real data, restoration lifts extreme-angle recognition by +15 to +38 whole-plate exact-match points (for example CCPD 42.5 to 80.8%, Brazilian 63.2 to 86.1%, Mercosur 66.0 to 96.5%). The POC generalizes this measured capability from plates to a second road-scene task and packages restoration, analytics, reliability scoring, and human-review routing into one reusable engine.</w:t>
+                  <w:t xml:space="preserve">In [1], AI restoration keeps oblique-view plates readable across about 90 to 92% of the [0, 89] degree angle grid at 90% or higher plate OCR accuracy (threshold T=0.9), near-perfect below 70 degrees and extending beyond 80 degrees on each axis. Five architectures (U-Net, conditional U-Net, Restormer, Pix2Pix-GAN, SR3 diffusion) cluster in a boundary-AUC band of 0.89 to 0.93, while the reliability score F separates dependable discriminative models (F 0.09 to 0.21) from a generative model with hidden failure pockets (F up to 1.12). On real data, restoration lifts extreme-angle whole-plate exact match by +15 to +38 points (CCPD 42.5 to 80.8%, Brazilian 63.2 to 86.1%, Mercosur 66.0 to 96.5%). The POC extends this from plates to a road-scene task in one reusable engine.</w:t>
                 </w:r>
               </w:p>
               <w:p>
@@ -5684,330 +5391,18 @@
                     <w:sz w:val="22"/>
                     <w:szCs w:val="22"/>
                   </w:rPr>
-                  <w:t xml:space="preserve">Prior-research to POC mapping (proposed addition):</w:t>
+                  <w:t xml:space="preserve">Prior-research to POC mapping: </w:t>
+                </w:r>
+                <w:r>
+                  <w:rPr>
+                    <w:rFonts w:ascii="Times New Roman" w:hAnsi="Times New Roman" w:cs="Times New Roman"/>
+                    <w:color w:val="C00000"/>
+                    <w:sz w:val="22"/>
+                    <w:szCs w:val="22"/>
+                  </w:rPr>
+                  <w:t xml:space="preserve">[1]'s Sobol acquisition-space augmentation extends from plates to road-scene objects (scenario generator, M5 to M10); its boundary-AUC and reliability score extend to multi-task outputs with human-review routing (reliability module, M11 to M16); rejection-based selective inference [13,15] becomes calibrated abstention on live input (uncertainty routing, M11 to M16); and offline benchmarking becomes validation on a realistic bounded scenario (M17 to M20).</w:t>
                 </w:r>
               </w:p>
-              <w:tbl>
-                <w:tblPr>
-                  <w:tblW w:w="0" w:type="auto"/>
-                  <w:tblBorders>
-                    <w:top w:val="single" w:sz="4" w:space="0" w:color="C00000"/>
-                    <w:left w:val="single" w:sz="4" w:space="0" w:color="C00000"/>
-                    <w:bottom w:val="single" w:sz="4" w:space="0" w:color="C00000"/>
-                    <w:right w:val="single" w:sz="4" w:space="0" w:color="C00000"/>
-                    <w:insideH w:val="single" w:sz="4" w:space="0" w:color="C00000"/>
-                    <w:insideV w:val="single" w:sz="4" w:space="0" w:color="C00000"/>
-                  </w:tblBorders>
-                  <w:tblLook w:val="04A0" w:firstRow="1" w:lastRow="0" w:firstColumn="1" w:lastColumn="0" w:noHBand="0" w:noVBand="1"/>
-                </w:tblPr>
-                <w:tblGrid>
-                  <w:gridCol w:w="2400"/>
-                  <w:gridCol w:w="3300"/>
-                  <w:gridCol w:w="3326"/>
-                </w:tblGrid>
-                <w:tr>
-                  <w:tc>
-                    <w:tcPr>
-                      <w:tcW w:w="2400" w:type="dxa"/>
-                    </w:tcPr>
-                    <w:p>
-                      <w:pPr>
-                        <w:spacing w:line="240" w:lineRule="auto"/>
-                      </w:pPr>
-                      <w:r>
-                        <w:rPr>
-                          <w:rFonts w:ascii="Times New Roman" w:hAnsi="Times New Roman" w:cs="Times New Roman"/>
-                          <w:b/>
-                          <w:bCs/>
-                          <w:color w:val="C00000"/>
-                          <w:sz w:val="22"/>
-                          <w:szCs w:val="22"/>
-                        </w:rPr>
-                        <w:t xml:space="preserve">Demonstrated in prior work [1]</w:t>
-                      </w:r>
-                    </w:p>
-                  </w:tc>
-                  <w:tc>
-                    <w:tcPr>
-                      <w:tcW w:w="3300" w:type="dxa"/>
-                    </w:tcPr>
-                    <w:p>
-                      <w:pPr>
-                        <w:spacing w:line="240" w:lineRule="auto"/>
-                      </w:pPr>
-                      <w:r>
-                        <w:rPr>
-                          <w:rFonts w:ascii="Times New Roman" w:hAnsi="Times New Roman" w:cs="Times New Roman"/>
-                          <w:b/>
-                          <w:bCs/>
-                          <w:color w:val="C00000"/>
-                          <w:sz w:val="22"/>
-                          <w:szCs w:val="22"/>
-                        </w:rPr>
-                        <w:t xml:space="preserve">What the POC adds</w:t>
-                      </w:r>
-                    </w:p>
-                  </w:tc>
-                  <w:tc>
-                    <w:tcPr>
-                      <w:tcW w:w="3326" w:type="dxa"/>
-                    </w:tcPr>
-                    <w:p>
-                      <w:pPr>
-                        <w:spacing w:line="240" w:lineRule="auto"/>
-                      </w:pPr>
-                      <w:r>
-                        <w:rPr>
-                          <w:rFonts w:ascii="Times New Roman" w:hAnsi="Times New Roman" w:cs="Times New Roman"/>
-                          <w:b/>
-                          <w:bCs/>
-                          <w:color w:val="C00000"/>
-                          <w:sz w:val="22"/>
-                          <w:szCs w:val="22"/>
-                        </w:rPr>
-                        <w:t xml:space="preserve">Deliverable (milestone)</w:t>
-                      </w:r>
-                    </w:p>
-                  </w:tc>
-                </w:tr>
-                <w:tr>
-                  <w:tc>
-                    <w:tcPr>
-                      <w:tcW w:w="2400" w:type="dxa"/>
-                    </w:tcPr>
-                    <w:p>
-                      <w:pPr>
-                        <w:spacing w:line="240" w:lineRule="auto"/>
-                      </w:pPr>
-                      <w:r>
-                        <w:rPr>
-                          <w:rFonts w:ascii="Times New Roman" w:hAnsi="Times New Roman" w:cs="Times New Roman"/>
-                          <w:color w:val="C00000"/>
-                          <w:sz w:val="22"/>
-                          <w:szCs w:val="22"/>
-                        </w:rPr>
-                        <w:t xml:space="preserve">Sobol-sampled acquisition-space augmentation for plate recovery</w:t>
-                      </w:r>
-                    </w:p>
-                  </w:tc>
-                  <w:tc>
-                    <w:tcPr>
-                      <w:tcW w:w="3300" w:type="dxa"/>
-                    </w:tcPr>
-                    <w:p>
-                      <w:pPr>
-                        <w:spacing w:line="240" w:lineRule="auto"/>
-                      </w:pPr>
-                      <w:r>
-                        <w:rPr>
-                          <w:rFonts w:ascii="Times New Roman" w:hAnsi="Times New Roman" w:cs="Times New Roman"/>
-                          <w:color w:val="C00000"/>
-                          <w:sz w:val="22"/>
-                          <w:szCs w:val="22"/>
-                        </w:rPr>
-                        <w:t xml:space="preserve">Generalize augmentation from plates to road-scene objects</w:t>
-                      </w:r>
-                    </w:p>
-                  </w:tc>
-                  <w:tc>
-                    <w:tcPr>
-                      <w:tcW w:w="3326" w:type="dxa"/>
-                    </w:tcPr>
-                    <w:p>
-                      <w:pPr>
-                        <w:spacing w:line="240" w:lineRule="auto"/>
-                      </w:pPr>
-                      <w:r>
-                        <w:rPr>
-                          <w:rFonts w:ascii="Times New Roman" w:hAnsi="Times New Roman" w:cs="Times New Roman"/>
-                          <w:color w:val="C00000"/>
-                          <w:sz w:val="22"/>
-                          <w:szCs w:val="22"/>
-                        </w:rPr>
-                        <w:t xml:space="preserve">Scenario generator (M5 to M10)</w:t>
-                      </w:r>
-                    </w:p>
-                  </w:tc>
-                </w:tr>
-                <w:tr>
-                  <w:tc>
-                    <w:tcPr>
-                      <w:tcW w:w="2400" w:type="dxa"/>
-                    </w:tcPr>
-                    <w:p>
-                      <w:pPr>
-                        <w:spacing w:line="240" w:lineRule="auto"/>
-                      </w:pPr>
-                      <w:r>
-                        <w:rPr>
-                          <w:rFonts w:ascii="Times New Roman" w:hAnsi="Times New Roman" w:cs="Times New Roman"/>
-                          <w:color w:val="C00000"/>
-                          <w:sz w:val="22"/>
-                          <w:szCs w:val="22"/>
-                        </w:rPr>
-                        <w:t xml:space="preserve">Boundary-AUC and reliability score for one OCR task</w:t>
-                      </w:r>
-                    </w:p>
-                  </w:tc>
-                  <w:tc>
-                    <w:tcPr>
-                      <w:tcW w:w="3300" w:type="dxa"/>
-                    </w:tcPr>
-                    <w:p>
-                      <w:pPr>
-                        <w:spacing w:line="240" w:lineRule="auto"/>
-                      </w:pPr>
-                      <w:r>
-                        <w:rPr>
-                          <w:rFonts w:ascii="Times New Roman" w:hAnsi="Times New Roman" w:cs="Times New Roman"/>
-                          <w:color w:val="C00000"/>
-                          <w:sz w:val="22"/>
-                          <w:szCs w:val="22"/>
-                        </w:rPr>
-                        <w:t xml:space="preserve">Extend to multi-task outputs and human-review routing</w:t>
-                      </w:r>
-                    </w:p>
-                  </w:tc>
-                  <w:tc>
-                    <w:tcPr>
-                      <w:tcW w:w="3326" w:type="dxa"/>
-                    </w:tcPr>
-                    <w:p>
-                      <w:pPr>
-                        <w:spacing w:line="240" w:lineRule="auto"/>
-                      </w:pPr>
-                      <w:r>
-                        <w:rPr>
-                          <w:rFonts w:ascii="Times New Roman" w:hAnsi="Times New Roman" w:cs="Times New Roman"/>
-                          <w:color w:val="C00000"/>
-                          <w:sz w:val="22"/>
-                          <w:szCs w:val="22"/>
-                        </w:rPr>
-                        <w:t xml:space="preserve">Reliability module (M11 to M16)</w:t>
-                      </w:r>
-                    </w:p>
-                  </w:tc>
-                </w:tr>
-                <w:tr>
-                  <w:tc>
-                    <w:tcPr>
-                      <w:tcW w:w="2400" w:type="dxa"/>
-                    </w:tcPr>
-                    <w:p>
-                      <w:pPr>
-                        <w:spacing w:line="240" w:lineRule="auto"/>
-                      </w:pPr>
-                      <w:r>
-                        <w:rPr>
-                          <w:rFonts w:ascii="Times New Roman" w:hAnsi="Times New Roman" w:cs="Times New Roman"/>
-                          <w:color w:val="C00000"/>
-                          <w:sz w:val="22"/>
-                          <w:szCs w:val="22"/>
-                        </w:rPr>
-                        <w:t xml:space="preserve">Rejection-based selective inference [13,15]</w:t>
-                      </w:r>
-                    </w:p>
-                  </w:tc>
-                  <w:tc>
-                    <w:tcPr>
-                      <w:tcW w:w="3300" w:type="dxa"/>
-                    </w:tcPr>
-                    <w:p>
-                      <w:pPr>
-                        <w:spacing w:line="240" w:lineRule="auto"/>
-                      </w:pPr>
-                      <w:r>
-                        <w:rPr>
-                          <w:rFonts w:ascii="Times New Roman" w:hAnsi="Times New Roman" w:cs="Times New Roman"/>
-                          <w:color w:val="C00000"/>
-                          <w:sz w:val="22"/>
-                          <w:szCs w:val="22"/>
-                        </w:rPr>
-                        <w:t xml:space="preserve">Calibrated abstention on live or streamed input</w:t>
-                      </w:r>
-                    </w:p>
-                  </w:tc>
-                  <w:tc>
-                    <w:tcPr>
-                      <w:tcW w:w="3326" w:type="dxa"/>
-                    </w:tcPr>
-                    <w:p>
-                      <w:pPr>
-                        <w:spacing w:line="240" w:lineRule="auto"/>
-                      </w:pPr>
-                      <w:r>
-                        <w:rPr>
-                          <w:rFonts w:ascii="Times New Roman" w:hAnsi="Times New Roman" w:cs="Times New Roman"/>
-                          <w:color w:val="C00000"/>
-                          <w:sz w:val="22"/>
-                          <w:szCs w:val="22"/>
-                        </w:rPr>
-                        <w:t xml:space="preserve">Uncertainty routing (M11 to M16)</w:t>
-                      </w:r>
-                    </w:p>
-                  </w:tc>
-                </w:tr>
-                <w:tr>
-                  <w:tc>
-                    <w:tcPr>
-                      <w:tcW w:w="2400" w:type="dxa"/>
-                    </w:tcPr>
-                    <w:p>
-                      <w:pPr>
-                        <w:spacing w:line="240" w:lineRule="auto"/>
-                      </w:pPr>
-                      <w:r>
-                        <w:rPr>
-                          <w:rFonts w:ascii="Times New Roman" w:hAnsi="Times New Roman" w:cs="Times New Roman"/>
-                          <w:color w:val="C00000"/>
-                          <w:sz w:val="22"/>
-                          <w:szCs w:val="22"/>
-                        </w:rPr>
-                        <w:t xml:space="preserve">Offline benchmark evaluation</w:t>
-                      </w:r>
-                    </w:p>
-                  </w:tc>
-                  <w:tc>
-                    <w:tcPr>
-                      <w:tcW w:w="3300" w:type="dxa"/>
-                    </w:tcPr>
-                    <w:p>
-                      <w:pPr>
-                        <w:spacing w:line="240" w:lineRule="auto"/>
-                      </w:pPr>
-                      <w:r>
-                        <w:rPr>
-                          <w:rFonts w:ascii="Times New Roman" w:hAnsi="Times New Roman" w:cs="Times New Roman"/>
-                          <w:color w:val="C00000"/>
-                          <w:sz w:val="22"/>
-                          <w:szCs w:val="22"/>
-                        </w:rPr>
-                        <w:t xml:space="preserve">Validation on a realistic bounded scenario</w:t>
-                      </w:r>
-                    </w:p>
-                  </w:tc>
-                  <w:tc>
-                    <w:tcPr>
-                      <w:tcW w:w="3326" w:type="dxa"/>
-                    </w:tcPr>
-                    <w:p>
-                      <w:pPr>
-                        <w:spacing w:line="240" w:lineRule="auto"/>
-                      </w:pPr>
-                      <w:r>
-                        <w:rPr>
-                          <w:rFonts w:ascii="Times New Roman" w:hAnsi="Times New Roman" w:cs="Times New Roman"/>
-                          <w:color w:val="C00000"/>
-                          <w:sz w:val="22"/>
-                          <w:szCs w:val="22"/>
-                        </w:rPr>
-                        <w:t xml:space="preserve">Partner or public-data validation (M17 to M20)</w:t>
-                      </w:r>
-                    </w:p>
-                  </w:tc>
-                </w:tr>
-              </w:tbl>
-              <w:p/>
               <w:p>
                 <w:pPr>
                   <w:spacing w:line="360" w:lineRule="auto"/>
@@ -6019,7 +5414,7 @@
                   </w:rPr>
                   <w:drawing>
                     <wp:inline distT="0" distB="0" distL="0" distR="0" wp14:anchorId="68C4615B" wp14:editId="591C804C">
-                      <wp:extent cx="2867025" cy="1893161"/>
+                      <wp:extent cx="1775262" cy="1172245"/>
                       <wp:effectExtent l="0" t="0" r="0" b="0"/>
                       <wp:docPr id="2" name="Picture 2"/>
                       <wp:cNvGraphicFramePr>
@@ -6041,7 +5436,7 @@
                             <pic:spPr>
                               <a:xfrm>
                                 <a:off x="0" y="0"/>
-                                <a:ext cx="2886780" cy="1906206"/>
+                                <a:ext cx="1787495" cy="1180322"/>
                               </a:xfrm>
                               <a:prstGeom prst="rect">
                                 <a:avLst/>
@@ -6091,102 +5486,11 @@
                 <w:r>
                   <w:rPr>
                     <w:rFonts w:ascii="Times New Roman" w:hAnsi="Times New Roman" w:cs="Times New Roman"/>
-                    <w:color w:val="000000"/>
+                    <w:color w:val="C00000"/>
+                    <w:sz w:val="22"/>
+                    <w:szCs w:val="22"/>
                   </w:rPr>
-                  <w:t>The second innovation was trust-aware evaluation. Modern restoration models, especially generative GAN and diffusion families, can sometimes produce outputs that look plausible while being wrong under low-signal conditions</w:t>
-                </w:r>
-                <w:r>
-                  <w:rPr>
-                    <w:rFonts w:ascii="Times New Roman" w:hAnsi="Times New Roman" w:cs="Times New Roman"/>
-                    <w:color w:val="000000"/>
-                  </w:rPr>
-                  <w:t xml:space="preserve"> [</w:t>
-                </w:r>
-                <w:r>
-                  <w:rPr>
-                    <w:rFonts w:ascii="Times New Roman" w:hAnsi="Times New Roman" w:cs="Times New Roman"/>
-                    <w:color w:val="000000"/>
-                  </w:rPr>
-                  <w:t>1</w:t>
-                </w:r>
-                <w:r>
-                  <w:rPr>
-                    <w:rFonts w:ascii="Times New Roman" w:hAnsi="Times New Roman" w:cs="Times New Roman"/>
-                    <w:color w:val="000000"/>
-                  </w:rPr>
-                  <w:t>2</w:t>
-                </w:r>
-                <w:r>
-                  <w:rPr>
-                    <w:rFonts w:ascii="Times New Roman" w:hAnsi="Times New Roman" w:cs="Times New Roman"/>
-                    <w:color w:val="000000"/>
-                  </w:rPr>
-                  <w:t>]</w:t>
-                </w:r>
-                <w:r>
-                  <w:rPr>
-                    <w:rFonts w:ascii="Times New Roman" w:hAnsi="Times New Roman" w:cs="Times New Roman"/>
-                    <w:color w:val="000000"/>
-                  </w:rPr>
-                  <w:t xml:space="preserve">. For operational use, restoration quality must therefore be tied to task utility and to the conditions under which the output remains dependable. Our prior work did this by evaluating downstream OCR performance and introducing two operating-condition metrics: boundary-AUC, which estimates the outer extent of the recoverable region, and a reliability score, which measures the frequency and depth of failures inside that nominally recoverable region [1]. </w:t>
-                </w:r>
-                <w:r>
-                  <w:rPr>
-                    <w:rFonts w:ascii="Times New Roman" w:hAnsi="Times New Roman" w:cs="Times New Roman"/>
-                    <w:color w:val="000000"/>
-                  </w:rPr>
-                  <w:t xml:space="preserve">This distinction separates models that cover a wide operating area uniformly from models that appear broadly capable but contain hidden failure pockets. The same trust-aware principle also appears in </w:t>
-                </w:r>
-                <w:r>
-                  <w:rPr>
-                    <w:rFonts w:ascii="Times New Roman" w:hAnsi="Times New Roman" w:cs="Times New Roman"/>
-                    <w:color w:val="000000"/>
-                  </w:rPr>
-                  <w:t>author’s</w:t>
-                </w:r>
-                <w:r>
-                  <w:rPr>
-                    <w:rFonts w:ascii="Times New Roman" w:hAnsi="Times New Roman" w:cs="Times New Roman"/>
-                    <w:color w:val="000000"/>
-                  </w:rPr>
-                  <w:t xml:space="preserve"> </w:t>
-                </w:r>
-                <w:r>
-                  <w:rPr>
-                    <w:rFonts w:ascii="Times New Roman" w:hAnsi="Times New Roman" w:cs="Times New Roman"/>
-                    <w:color w:val="000000"/>
-                  </w:rPr>
-                  <w:t>work on chest X-ray classification with rejection mechanisms, where uncertain predictions are deferred instead of forced into automatic decisions [</w:t>
-                </w:r>
-                <w:r>
-                  <w:rPr>
-                    <w:rFonts w:ascii="Times New Roman" w:hAnsi="Times New Roman" w:cs="Times New Roman"/>
-                    <w:color w:val="000000"/>
-                  </w:rPr>
-                  <w:t>13</w:t>
-                </w:r>
-                <w:r>
-                  <w:rPr>
-                    <w:rFonts w:ascii="Times New Roman" w:hAnsi="Times New Roman" w:cs="Times New Roman"/>
-                    <w:color w:val="000000"/>
-                  </w:rPr>
-                  <w:t>].</w:t>
-                </w:r>
-              </w:p>
-              <w:p>
-                <w:pPr>
-                  <w:spacing w:line="360" w:lineRule="auto"/>
-                  <w:ind w:firstLine="720"/>
-                  <w:jc w:val="both"/>
-                  <w:rPr>
-                    <w:rFonts w:asciiTheme="majorBidi" w:hAnsiTheme="majorBidi" w:cstheme="majorBidi"/>
-                  </w:rPr>
-                </w:pPr>
-                <w:r>
-                  <w:rPr>
-                    <w:rFonts w:asciiTheme="majorBidi" w:hAnsiTheme="majorBidi" w:cstheme="majorBidi"/>
-                  </w:rPr>
-                  <w:t>The present POC builds on this established scientific basis and focuses on translating these capabilities into an integrated, reusable operational engine combining restoration, analytics, reliability assessment, and uncertainty-aware routing.</w:t>
+                  <w:t xml:space="preserve">The second innovation is trust-aware evaluation. Generative GAN and diffusion restorers can look plausible while being wrong at low signal [12], so restoration quality must be tied to task utility and to the conditions under which output stays dependable. Prior work [1] evaluated downstream OCR and introduced two metrics: boundary-AUC, the outer extent of the recoverable region, and a reliability score, the frequency and depth of failures inside it, separating uniformly-capable models from those with hidden failure pockets. The same principle appears in the PI's chest X-ray classification with rejection [13].</w:t>
                 </w:r>
               </w:p>
               <w:p>
@@ -6238,37 +5542,11 @@
                 <w:r>
                   <w:rPr>
                     <w:rFonts w:ascii="Times New Roman" w:hAnsi="Times New Roman" w:cs="Times New Roman"/>
-                    <w:color w:val="000000"/>
+                    <w:color w:val="C00000"/>
+                    <w:sz w:val="22"/>
+                    <w:szCs w:val="22"/>
                   </w:rPr>
-                  <w:t>Cloud GPU compute: used to train and compare large restoration and analytics models across source types, degradation levels, target applications, and model families. It will also support repeated experimental sweeps needed to establish recoverability maps, task-specific performance measurements, reliability scores, and failure-region analysis.</w:t>
-                </w:r>
-              </w:p>
-              <w:p>
-                <w:pPr>
-                  <w:spacing w:line="360" w:lineRule="auto"/>
-                  <w:ind w:firstLine="720"/>
-                  <w:jc w:val="both"/>
-                </w:pPr>
-                <w:r>
-                  <w:rPr>
-                    <w:rFonts w:ascii="Times New Roman" w:hAnsi="Times New Roman" w:cs="Times New Roman"/>
-                    <w:color w:val="000000"/>
-                  </w:rPr>
-                  <w:t>Cloud storage and visual data infrastructure: used to store large synthetic and permitted real visual datasets, including vehicles, streets, infrastructure, public-space events, citizen-uploaded media, and surveillance-like footage. It will also store generated training sets, augmented variants across viewing angle, perspective distortion, resolution, blur, motion, compression, illumination, occlusion, and sensor placement, plus model checkpoints, evaluation outputs, and recoverability-map artifacts.</w:t>
-                </w:r>
-              </w:p>
-              <w:p>
-                <w:pPr>
-                  <w:spacing w:line="360" w:lineRule="auto"/>
-                  <w:ind w:firstLine="720"/>
-                  <w:jc w:val="both"/>
-                </w:pPr>
-                <w:r>
-                  <w:rPr>
-                    <w:rFonts w:ascii="Times New Roman" w:hAnsi="Times New Roman" w:cs="Times New Roman"/>
-                    <w:color w:val="000000"/>
-                  </w:rPr>
-                  <w:t>Software engineer or research assistant: used to implement the reusable ReSight core engine, including data ingestion, augmentation workflows, model-experiment orchestration, recoverability-map generation, reliability scoring, and a demonstration interface for selected validation scenarios.</w:t>
+                  <w:t xml:space="preserve">Required resources: (1) cloud GPU compute to train and compare restoration and analytics models across source types, degradations, and model families, and to run the sweeps that build recoverability maps, reliability scores, and failure-region analysis; (2) cloud storage for synthetic and permitted real datasets, augmented variants, checkpoints, and evaluation artifacts; (3) a part-time software engineer or research assistant to build the engine, data and augmentation pipelines, experiment orchestration, reliability scoring, and the demonstrator.</w:t>
                 </w:r>
               </w:p>
               <w:p>
@@ -6299,9 +5577,11 @@
                 <w:r>
                   <w:rPr>
                     <w:rFonts w:ascii="Times New Roman" w:hAnsi="Times New Roman" w:cs="Times New Roman"/>
-                    <w:color w:val="000000"/>
+                    <w:color w:val="C00000"/>
+                    <w:sz w:val="22"/>
+                    <w:szCs w:val="22"/>
                   </w:rPr>
-                  <w:t>ReSight will be developed as a scalable AI inference engine for opportunistic visual sensing. The initial architecture will be cloud-first, using cloud GPU resources for heavy restoration, analytics, reliability estimation, and recoverability-map generation. The engine will be configurable to specific tasks and operational regimes, ingesting visual inputs from existing cameras, video files, still images, body cameras, dashboard cameras, ATM cameras, and citizen-uploaded media. Its output will be a structured stream of insights, confidence indicators, failure-region warnings, and human-review flags that can be consumed by subscribing systems through an API.</w:t>
+                  <w:t xml:space="preserve">ReSight will be a scalable, cloud-first AI inference engine: cloud GPU for heavy restoration, analytics, reliability estimation, and recoverability-map generation, configurable per task and regime, ingesting existing cameras, video, images, body-cam, dashcam, ATM, and citizen media, and emitting a structured stream of insights, confidence indicators, failure-region warnings, and human-review flags over an API.</w:t>
                 </w:r>
               </w:p>
               <w:p>
@@ -6313,44 +5593,11 @@
                 <w:r>
                   <w:rPr>
                     <w:rFonts w:ascii="Times New Roman" w:hAnsi="Times New Roman" w:cs="Times New Roman"/>
-                    <w:color w:val="000000"/>
+                    <w:color w:val="C00000"/>
+                    <w:sz w:val="22"/>
+                    <w:szCs w:val="22"/>
                   </w:rPr>
-                  <w:t>Beyond the present POC, the technology has two natural development directions</w:t>
-                </w:r>
-                <w:r>
-                  <w:rPr>
-                    <w:rFonts w:ascii="Times New Roman" w:hAnsi="Times New Roman" w:cs="Times New Roman"/>
-                    <w:color w:val="000000"/>
-                  </w:rPr>
-                  <w:t>. First, compact model variants can be adapted for on-board camera or edge-device inference where latency, bandwidth, privacy, or connectivity constraints make local processing valuable. This direction is supported by PTEENet and CalexNet, prior work on lightweight early-exit branches and calibrated selective inference [</w:t>
-                </w:r>
-                <w:r>
-                  <w:rPr>
-                    <w:rFonts w:ascii="Times New Roman" w:hAnsi="Times New Roman" w:cs="Times New Roman"/>
-                    <w:color w:val="000000"/>
-                  </w:rPr>
-                  <w:t>14,15</w:t>
-                </w:r>
-                <w:r>
-                  <w:rPr>
-                    <w:rFonts w:ascii="Times New Roman" w:hAnsi="Times New Roman" w:cs="Times New Roman"/>
-                    <w:color w:val="000000"/>
-                  </w:rPr>
-                  <w:t>]. Second, body-worn and mobile footage can be converted into compact situational views, building on prior work on panoramic incident summaries from long field videos [</w:t>
-                </w:r>
-                <w:r>
-                  <w:rPr>
-                    <w:rFonts w:ascii="Times New Roman" w:hAnsi="Times New Roman" w:cs="Times New Roman"/>
-                    <w:color w:val="000000"/>
-                  </w:rPr>
-                  <w:t>16</w:t>
-                </w:r>
-                <w:r>
-                  <w:rPr>
-                    <w:rFonts w:ascii="Times New Roman" w:hAnsi="Times New Roman" w:cs="Times New Roman"/>
-                    <w:color w:val="000000"/>
-                  </w:rPr>
-                  <w:t>]. Together, these paths give ReSight a practical product architecture: cloud GPU inference for complex tasks and large-scale experimentation, with future options for lighter on-camera analytics and field-video summarization in selected validated scenarios.</w:t>
+                  <w:t xml:space="preserve">Beyond the POC, two directions follow: compact edge or on-camera variants where latency, bandwidth, privacy, or connectivity constrain processing, supported by prior work on lightweight early-exit and calibrated selective inference [14,15]; and conversion of body-worn or mobile footage into compact situational views, building on panoramic incident summaries [16]. Together these give a cloud-plus-edge product path.</w:t>
                 </w:r>
               </w:p>
               <w:p>
@@ -6381,23 +5628,11 @@
                 <w:r>
                   <w:rPr>
                     <w:rFonts w:ascii="Times New Roman" w:hAnsi="Times New Roman" w:cs="Times New Roman"/>
-                    <w:color w:val="000000"/>
+                    <w:color w:val="C00000"/>
+                    <w:sz w:val="22"/>
+                    <w:szCs w:val="22"/>
                   </w:rPr>
-                  <w:t>We will seek a validation partnership with a municipality, such as Tel Aviv-Yafo, or a video-analytics provider, such as Motorola Solutions [</w:t>
-                </w:r>
-                <w:r>
-                  <w:rPr>
-                    <w:rFonts w:ascii="Times New Roman" w:hAnsi="Times New Roman" w:cs="Times New Roman"/>
-                    <w:color w:val="000000"/>
-                  </w:rPr>
-                  <w:t>17,18</w:t>
-                </w:r>
-                <w:r>
-                  <w:rPr>
-                    <w:rFonts w:ascii="Times New Roman" w:hAnsi="Times New Roman" w:cs="Times New Roman"/>
-                    <w:color w:val="000000"/>
-                  </w:rPr>
-                  <w:t>], to help define operational requirements, success criteria, and commercialization needs. The preferred first use case is a bounded smart-city scenario, such as citizen-reported road hazards or infrastructure damage, suitable for demonstrating the value of repurposing existing visual sources using synthetic, public, or approved field data.</w:t>
+                  <w:t xml:space="preserve">No external partner is committed at submission, and the plan does not depend on one. Validation uses public datasets (UFPR-ALPR, CCPD) and permitted field footage together with synthetic data. A municipality or a video-analytics vendor may be engaged opportunistically for operational feedback and commercialization input [17,18], but this is not required for the POC.</w:t>
                 </w:r>
               </w:p>
               <w:p>
@@ -6414,7 +5649,7 @@
                     <w:sz w:val="22"/>
                     <w:szCs w:val="22"/>
                   </w:rPr>
-                  <w:t xml:space="preserve">Commercialization and IP (proposed addition): </w:t>
+                  <w:t xml:space="preserve">Risk analysis: </w:t>
                 </w:r>
                 <w:r>
                   <w:rPr>
@@ -6423,249 +5658,9 @@
                     <w:sz w:val="22"/>
                     <w:szCs w:val="22"/>
                   </w:rPr>
-                  <w:t xml:space="preserve">Beachhead: license the reliability-scoring and failure-routing module as a plug-in to video-analytics and VMS vendors, via Afeka’s technology-transfer office. The Sobol augmentation and reliability-score methods are already published; the patentable element in this POC is the failure-region detection and human-review routing mechanism, for which a provisional filing is planned by Month 20.</w:t>
+                  <w:t xml:space="preserve">the synthetic-to-real gap is handled by a domain-randomized generator plus public real data for validation; generative hallucination is bounded by the reliability score with abstention and a reported false-accept rate; blocked data access falls back to synthetic and public datasets (UFPR-ALPR, CCPD); compute overrun is capped by a fixed cloud budget with checkpointing.</w:t>
                 </w:r>
               </w:p>
-              <w:p>
-                <w:pPr>
-                  <w:spacing w:line="360" w:lineRule="auto"/>
-                  <w:jc w:val="both"/>
-                </w:pPr>
-                <w:r>
-                  <w:rPr>
-                    <w:rFonts w:ascii="Times New Roman" w:hAnsi="Times New Roman" w:cs="Times New Roman"/>
-                    <w:b/>
-                    <w:bCs/>
-                    <w:color w:val="C00000"/>
-                    <w:sz w:val="22"/>
-                    <w:szCs w:val="22"/>
-                  </w:rPr>
-                  <w:t xml:space="preserve">Risk analysis (proposed addition):</w:t>
-                </w:r>
-              </w:p>
-              <w:tbl>
-                <w:tblPr>
-                  <w:tblW w:w="0" w:type="auto"/>
-                  <w:tblBorders>
-                    <w:top w:val="single" w:sz="4" w:space="0" w:color="C00000"/>
-                    <w:left w:val="single" w:sz="4" w:space="0" w:color="C00000"/>
-                    <w:bottom w:val="single" w:sz="4" w:space="0" w:color="C00000"/>
-                    <w:right w:val="single" w:sz="4" w:space="0" w:color="C00000"/>
-                    <w:insideH w:val="single" w:sz="4" w:space="0" w:color="C00000"/>
-                    <w:insideV w:val="single" w:sz="4" w:space="0" w:color="C00000"/>
-                  </w:tblBorders>
-                  <w:tblLook w:val="04A0" w:firstRow="1" w:lastRow="0" w:firstColumn="1" w:lastColumn="0" w:noHBand="0" w:noVBand="1"/>
-                </w:tblPr>
-                <w:tblGrid>
-                  <w:gridCol w:w="4513"/>
-                  <w:gridCol w:w="4513"/>
-                </w:tblGrid>
-                <w:tr>
-                  <w:tc>
-                    <w:tcPr>
-                      <w:tcW w:w="4513" w:type="dxa"/>
-                    </w:tcPr>
-                    <w:p>
-                      <w:pPr>
-                        <w:spacing w:line="240" w:lineRule="auto"/>
-                      </w:pPr>
-                      <w:r>
-                        <w:rPr>
-                          <w:rFonts w:ascii="Times New Roman" w:hAnsi="Times New Roman" w:cs="Times New Roman"/>
-                          <w:b/>
-                          <w:bCs/>
-                          <w:color w:val="C00000"/>
-                          <w:sz w:val="22"/>
-                          <w:szCs w:val="22"/>
-                        </w:rPr>
-                        <w:t xml:space="preserve">Risk</w:t>
-                      </w:r>
-                    </w:p>
-                  </w:tc>
-                  <w:tc>
-                    <w:tcPr>
-                      <w:tcW w:w="4513" w:type="dxa"/>
-                    </w:tcPr>
-                    <w:p>
-                      <w:pPr>
-                        <w:spacing w:line="240" w:lineRule="auto"/>
-                      </w:pPr>
-                      <w:r>
-                        <w:rPr>
-                          <w:rFonts w:ascii="Times New Roman" w:hAnsi="Times New Roman" w:cs="Times New Roman"/>
-                          <w:b/>
-                          <w:bCs/>
-                          <w:color w:val="C00000"/>
-                          <w:sz w:val="22"/>
-                          <w:szCs w:val="22"/>
-                        </w:rPr>
-                        <w:t xml:space="preserve">Mitigation</w:t>
-                      </w:r>
-                    </w:p>
-                  </w:tc>
-                </w:tr>
-                <w:tr>
-                  <w:tc>
-                    <w:tcPr>
-                      <w:tcW w:w="4513" w:type="dxa"/>
-                    </w:tcPr>
-                    <w:p>
-                      <w:pPr>
-                        <w:spacing w:line="240" w:lineRule="auto"/>
-                      </w:pPr>
-                      <w:r>
-                        <w:rPr>
-                          <w:rFonts w:ascii="Times New Roman" w:hAnsi="Times New Roman" w:cs="Times New Roman"/>
-                          <w:color w:val="C00000"/>
-                          <w:sz w:val="22"/>
-                          <w:szCs w:val="22"/>
-                        </w:rPr>
-                        <w:t xml:space="preserve">Synthetic-to-real gap</w:t>
-                      </w:r>
-                    </w:p>
-                  </w:tc>
-                  <w:tc>
-                    <w:tcPr>
-                      <w:tcW w:w="4513" w:type="dxa"/>
-                    </w:tcPr>
-                    <w:p>
-                      <w:pPr>
-                        <w:spacing w:line="240" w:lineRule="auto"/>
-                      </w:pPr>
-                      <w:r>
-                        <w:rPr>
-                          <w:rFonts w:ascii="Times New Roman" w:hAnsi="Times New Roman" w:cs="Times New Roman"/>
-                          <w:color w:val="C00000"/>
-                          <w:sz w:val="22"/>
-                          <w:szCs w:val="22"/>
-                        </w:rPr>
-                        <w:t xml:space="preserve">Domain-randomized generator; partner or public real data for M17 to M20 validation</w:t>
-                      </w:r>
-                    </w:p>
-                  </w:tc>
-                </w:tr>
-                <w:tr>
-                  <w:tc>
-                    <w:tcPr>
-                      <w:tcW w:w="4513" w:type="dxa"/>
-                    </w:tcPr>
-                    <w:p>
-                      <w:pPr>
-                        <w:spacing w:line="240" w:lineRule="auto"/>
-                      </w:pPr>
-                      <w:r>
-                        <w:rPr>
-                          <w:rFonts w:ascii="Times New Roman" w:hAnsi="Times New Roman" w:cs="Times New Roman"/>
-                          <w:color w:val="C00000"/>
-                          <w:sz w:val="22"/>
-                          <w:szCs w:val="22"/>
-                        </w:rPr>
-                        <w:t xml:space="preserve">Generative hallucination (confident wrong plate)</w:t>
-                      </w:r>
-                    </w:p>
-                  </w:tc>
-                  <w:tc>
-                    <w:tcPr>
-                      <w:tcW w:w="4513" w:type="dxa"/>
-                    </w:tcPr>
-                    <w:p>
-                      <w:pPr>
-                        <w:spacing w:line="240" w:lineRule="auto"/>
-                      </w:pPr>
-                      <w:r>
-                        <w:rPr>
-                          <w:rFonts w:ascii="Times New Roman" w:hAnsi="Times New Roman" w:cs="Times New Roman"/>
-                          <w:color w:val="C00000"/>
-                          <w:sz w:val="22"/>
-                          <w:szCs w:val="22"/>
-                        </w:rPr>
-                        <w:t xml:space="preserve">Reliability score plus abstention; report false-accept rate as a primary metric</w:t>
-                      </w:r>
-                    </w:p>
-                  </w:tc>
-                </w:tr>
-                <w:tr>
-                  <w:tc>
-                    <w:tcPr>
-                      <w:tcW w:w="4513" w:type="dxa"/>
-                    </w:tcPr>
-                    <w:p>
-                      <w:pPr>
-                        <w:spacing w:line="240" w:lineRule="auto"/>
-                      </w:pPr>
-                      <w:r>
-                        <w:rPr>
-                          <w:rFonts w:ascii="Times New Roman" w:hAnsi="Times New Roman" w:cs="Times New Roman"/>
-                          <w:color w:val="C00000"/>
-                          <w:sz w:val="22"/>
-                          <w:szCs w:val="22"/>
-                        </w:rPr>
-                        <w:t xml:space="preserve">Partner or data access blocked</w:t>
-                      </w:r>
-                    </w:p>
-                  </w:tc>
-                  <w:tc>
-                    <w:tcPr>
-                      <w:tcW w:w="4513" w:type="dxa"/>
-                    </w:tcPr>
-                    <w:p>
-                      <w:pPr>
-                        <w:spacing w:line="240" w:lineRule="auto"/>
-                      </w:pPr>
-                      <w:r>
-                        <w:rPr>
-                          <w:rFonts w:ascii="Times New Roman" w:hAnsi="Times New Roman" w:cs="Times New Roman"/>
-                          <w:color w:val="C00000"/>
-                          <w:sz w:val="22"/>
-                          <w:szCs w:val="22"/>
-                        </w:rPr>
-                        <w:t xml:space="preserve">Synthetic-only plus public-dataset fallback (UFPR-ALPR, CCPD)</w:t>
-                      </w:r>
-                    </w:p>
-                  </w:tc>
-                </w:tr>
-                <w:tr>
-                  <w:tc>
-                    <w:tcPr>
-                      <w:tcW w:w="4513" w:type="dxa"/>
-                    </w:tcPr>
-                    <w:p>
-                      <w:pPr>
-                        <w:spacing w:line="240" w:lineRule="auto"/>
-                      </w:pPr>
-                      <w:r>
-                        <w:rPr>
-                          <w:rFonts w:ascii="Times New Roman" w:hAnsi="Times New Roman" w:cs="Times New Roman"/>
-                          <w:color w:val="C00000"/>
-                          <w:sz w:val="22"/>
-                          <w:szCs w:val="22"/>
-                        </w:rPr>
-                        <w:t xml:space="preserve">Compute cost overrun</w:t>
-                      </w:r>
-                    </w:p>
-                  </w:tc>
-                  <w:tc>
-                    <w:tcPr>
-                      <w:tcW w:w="4513" w:type="dxa"/>
-                    </w:tcPr>
-                    <w:p>
-                      <w:pPr>
-                        <w:spacing w:line="240" w:lineRule="auto"/>
-                      </w:pPr>
-                      <w:r>
-                        <w:rPr>
-                          <w:rFonts w:ascii="Times New Roman" w:hAnsi="Times New Roman" w:cs="Times New Roman"/>
-                          <w:color w:val="C00000"/>
-                          <w:sz w:val="22"/>
-                          <w:szCs w:val="22"/>
-                        </w:rPr>
-                        <w:t xml:space="preserve">Fixed cloud budget with checkpointing and capped sweeps</w:t>
-                      </w:r>
-                    </w:p>
-                  </w:tc>
-                </w:tr>
-              </w:tbl>
-              <w:p/>
             </w:tc>
           </w:sdtContent>
         </w:sdt>
@@ -7585,7 +6580,7 @@
                 <w:rFonts w:ascii="Times New Roman" w:hAnsi="Times New Roman" w:cs="Times New Roman"/>
                 <w:color w:val="000000"/>
               </w:rPr>
-              <w:t>Validate the core engine on a realistic smart-city, surveillance, or defense scenario with feedback from engaged validation partners.</w:t>
+              <w:t>Validate the core engine on a realistic smart-city, surveillance, or defense scenario using public and permitted field data.</w:t>
             </w:r>
           </w:p>
         </w:tc>
@@ -7945,7 +6940,7 @@
                 <w:rFonts w:ascii="Times New Roman" w:hAnsi="Times New Roman" w:cs="Times New Roman"/>
                 <w:color w:val="000000"/>
               </w:rPr>
-              <w:t>Prepare the initial validation-partner and commercialization document focused on recovering additional value from existing sensors.</w:t>
+              <w:t>Prepare the initial commercialization document focused on recovering additional value from existing sensors.</w:t>
             </w:r>
           </w:p>
         </w:tc>
@@ -8082,7 +7077,7 @@
           <w:sz w:val="22"/>
           <w:szCs w:val="22"/>
         </w:rPr>
-        <w:t xml:space="preserve">Go/no-go gates (proposed addition): </w:t>
+        <w:t xml:space="preserve">Go/no-go gates: </w:t>
       </w:r>
       <w:r>
         <w:rPr>
@@ -8091,7 +7086,7 @@
           <w:sz w:val="22"/>
           <w:szCs w:val="22"/>
         </w:rPr>
-        <w:t xml:space="preserve">G1 at M10: generator plus baseline meet their target on synthetic data. G2 at M16: reliability score meets its AUROC target. Task 3 depends on Task 2. Partner engagement and a public-dataset fallback (UFPR-ALPR, CCPD) start in Months 1 to 4 rather than only at M17 to M20, so validation does not depend on a partner materializing.</w:t>
+        <w:t xml:space="preserve">G1 (M10): the generator reproduces [1]'s angle-recoverability map within 0.05 in T and the baseline is within 3 exact-match points of [1] (fallback: restrict to the sub-range where T is at least 0.9). G2 (M16): boundary-AUC at least 0.92 on held-out real data (fallback: conformal calibration and a narrower angle range). G3 (M20): at least 40% fewer human-review items at false-accept rate at most 1% on held-out real data. Task 3 depends on Task 2; a continuous real-data acquisition and annotation task runs M3 to M12, producing at least 2,000 angle-binned plates (field footage plus UFPR-ALPR and CCPD) frozen at M12.</w:t>
       </w:r>
     </w:p>
     <w:p>
@@ -8791,55 +7786,12 @@
       </w:pPr>
       <w:r>
         <w:rPr>
-          <w:rFonts w:asciiTheme="majorBidi" w:hAnsiTheme="majorBidi" w:cstheme="majorBidi"/>
-          <w:sz w:val="22"/>
-          <w:szCs w:val="22"/>
-        </w:rPr>
-        <w:t xml:space="preserve">Aperstein, Y., Tzahar, A., Gottlib, A., Verber, T., Shagan Damti, R., &amp; Apartsin, A. (2025). </w:t>
-      </w:r>
-      <w:r>
-        <w:rPr>
-          <w:rFonts w:asciiTheme="majorBidi" w:hAnsiTheme="majorBidi" w:cstheme="majorBidi"/>
-          <w:i/>
-          <w:iCs/>
-          <w:sz w:val="22"/>
-          <w:szCs w:val="22"/>
-        </w:rPr>
-        <w:t>Multi-pathology chest X-ray classification with rejection mechanisms</w:t>
-      </w:r>
-      <w:r>
-        <w:rPr>
-          <w:rFonts w:asciiTheme="majorBidi" w:hAnsiTheme="majorBidi" w:cstheme="majorBidi"/>
-          <w:sz w:val="22"/>
-          <w:szCs w:val="22"/>
-        </w:rPr>
-        <w:t xml:space="preserve">. arXiv. </w:t>
-      </w:r>
-      <w:hyperlink r:id="rId24">
-        <w:r>
-          <w:rPr>
-            <w:rStyle w:val="Hyperlink"/>
-            <w:rFonts w:asciiTheme="majorBidi" w:hAnsiTheme="majorBidi" w:cstheme="majorBidi"/>
-            <w:sz w:val="22"/>
-            <w:szCs w:val="22"/>
-          </w:rPr>
-          <w:t>https://doi.org/10.48550/arXiv.2509.10348</w:t>
-        </w:r>
-      </w:hyperlink>
-    </w:p>
-    <w:p>
-      <w:pPr>
-        <w:spacing w:line="360" w:lineRule="auto"/>
-        <w:jc w:val="both"/>
-      </w:pPr>
-      <w:r>
-        <w:rPr>
           <w:rFonts w:ascii="Times New Roman" w:hAnsi="Times New Roman" w:cs="Times New Roman"/>
           <w:color w:val="C00000"/>
           <w:sz w:val="22"/>
           <w:szCs w:val="22"/>
         </w:rPr>
-        <w:t xml:space="preserve">[Update: reference [13] is now published as "Selective multipathology chest X-ray classification via rejection mechanisms", Scientific Reports (2026), https://www.nature.com/articles/s41598-026-66294-7 . Update the entry accordingly.]</w:t>
+        <w:t xml:space="preserve">Aperstein, Y., Tzahar, A., Gottlib, A., Verber, T., Damti, R. S., &amp; Apartsin, A. (2026). Selective multipathology chest X-ray classification via rejection mechanisms. Scientific Reports. https://www.nature.com/articles/s41598-026-66294-7</w:t>
       </w:r>
     </w:p>
     <w:p>
@@ -9910,107 +8862,6 @@
               <w:pStyle w:val="Subtitle"/>
               <w:jc w:val="both"/>
               <w:rPr>
-                <w:rFonts w:asciiTheme="majorBidi" w:hAnsiTheme="majorBidi"/>
-                <w:color w:val="auto"/>
-                <w:sz w:val="22"/>
-                <w:szCs w:val="22"/>
-              </w:rPr>
-            </w:pPr>
-            <w:r>
-              <w:rPr>
-                <w:rFonts w:asciiTheme="majorBidi" w:hAnsiTheme="majorBidi"/>
-                <w:color w:val="auto"/>
-                <w:sz w:val="22"/>
-                <w:szCs w:val="22"/>
-              </w:rPr>
-              <w:t>Weizmann Institute of Science</w:t>
-            </w:r>
-          </w:p>
-        </w:tc>
-        <w:tc>
-          <w:tcPr>
-            <w:tcW w:w="1134" w:type="dxa"/>
-            <w:vAlign w:val="center"/>
-          </w:tcPr>
-          <w:p>
-            <w:pPr>
-              <w:pStyle w:val="Subtitle"/>
-              <w:jc w:val="both"/>
-              <w:rPr>
-                <w:rFonts w:asciiTheme="majorBidi" w:hAnsiTheme="majorBidi"/>
-                <w:color w:val="auto"/>
-                <w:sz w:val="22"/>
-                <w:szCs w:val="22"/>
-              </w:rPr>
-            </w:pPr>
-          </w:p>
-        </w:tc>
-        <w:tc>
-          <w:tcPr>
-            <w:tcW w:w="1701" w:type="dxa"/>
-            <w:vAlign w:val="center"/>
-          </w:tcPr>
-          <w:p>
-            <w:pPr>
-              <w:pStyle w:val="Subtitle"/>
-              <w:jc w:val="both"/>
-              <w:rPr>
-                <w:rFonts w:asciiTheme="majorBidi" w:hAnsiTheme="majorBidi"/>
-                <w:color w:val="auto"/>
-                <w:sz w:val="22"/>
-                <w:szCs w:val="22"/>
-              </w:rPr>
-            </w:pPr>
-            <w:r>
-              <w:rPr>
-                <w:rFonts w:asciiTheme="majorBidi" w:hAnsiTheme="majorBidi"/>
-                <w:color w:val="auto"/>
-                <w:sz w:val="22"/>
-                <w:szCs w:val="22"/>
-              </w:rPr>
-              <w:t>2003-2005</w:t>
-            </w:r>
-          </w:p>
-        </w:tc>
-        <w:tc>
-          <w:tcPr>
-            <w:tcW w:w="3969" w:type="dxa"/>
-            <w:vAlign w:val="center"/>
-          </w:tcPr>
-          <w:p>
-            <w:pPr>
-              <w:pStyle w:val="Subtitle"/>
-              <w:jc w:val="both"/>
-              <w:rPr>
-                <w:rFonts w:asciiTheme="majorBidi" w:hAnsiTheme="majorBidi"/>
-                <w:color w:val="auto"/>
-                <w:sz w:val="22"/>
-                <w:szCs w:val="22"/>
-              </w:rPr>
-            </w:pPr>
-            <w:r>
-              <w:rPr>
-                <w:rFonts w:asciiTheme="majorBidi" w:hAnsiTheme="majorBidi"/>
-                <w:color w:val="auto"/>
-                <w:sz w:val="22"/>
-                <w:szCs w:val="22"/>
-              </w:rPr>
-              <w:t>Enrichment Program in Economics, Finance, and Management (MBA Equivalent)</w:t>
-            </w:r>
-          </w:p>
-        </w:tc>
-      </w:tr>
-      <w:tr>
-        <w:tc>
-          <w:tcPr>
-            <w:tcW w:w="3397" w:type="dxa"/>
-            <w:vAlign w:val="center"/>
-          </w:tcPr>
-          <w:p>
-            <w:pPr>
-              <w:pStyle w:val="Subtitle"/>
-              <w:jc w:val="both"/>
-              <w:rPr>
                 <w:rFonts w:asciiTheme="majorBidi" w:eastAsiaTheme="minorHAnsi" w:hAnsiTheme="majorBidi"/>
                 <w:color w:val="auto"/>
                 <w:spacing w:val="0"/>
@@ -10294,13 +9145,26 @@
       </w:pPr>
       <w:r>
         <w:rPr>
+          <w:rFonts w:ascii="Times New Roman" w:hAnsi="Times New Roman" w:cs="Times New Roman"/>
+          <w:color w:val="C00000"/>
+          <w:sz w:val="22"/>
+          <w:szCs w:val="22"/>
+        </w:rPr>
+        <w:t xml:space="preserve">My group studies reliable AI inference under degraded input. Three lines underpin this POC: (a) mapping license-plate recoverability as a function of viewing angle and degradation [1]; (b) selective prediction that abstains when uncertain, in chest X-ray classification with rejection (Scientific Reports 2026) and in efficient early-exit networks (PTEENet, IEEE Access 2022; CalexNet, Electronics 2026); and (c) active learning for medical image segmentation (Expert Systems with Applications 2025). ReSight applies (a) and (b) to off-regime cameras. I have led 15 funded projects (about NIS 2.35 million) for the Israeli Ministry of Defense and the Ministry of Innovation, Science and Technology, delivering working systems to government customers.</w:t>
+      </w:r>
+    </w:p>
+    <w:p>
+      <w:pPr>
+        <w:spacing w:after="0" w:line="360" w:lineRule="auto"/>
+        <w:ind w:firstLine="357"/>
+        <w:jc w:val="both"/>
+        <w:rPr>
           <w:rFonts w:ascii="David" w:hAnsi="David" w:cs="David"/>
           <w:sz w:val="24"/>
           <w:szCs w:val="28"/>
           <w:lang w:val="en-IL"/>
         </w:rPr>
-        <w:t xml:space="preserve">Dr. Yehudit Aperstein </w:t>
-      </w:r>
+      </w:pPr>
       <w:r>
         <w:rPr>
           <w:rFonts w:ascii="David" w:hAnsi="David" w:cs="David"/>
@@ -10308,38 +9172,33 @@
           <w:szCs w:val="28"/>
           <w:lang w:val="en-IL"/>
         </w:rPr>
-        <w:t xml:space="preserve">is </w:t>
-      </w:r>
-      <w:r>
-        <w:rPr>
-          <w:rFonts w:ascii="David" w:hAnsi="David" w:cs="David"/>
-          <w:sz w:val="24"/>
-          <w:szCs w:val="28"/>
-          <w:lang w:val="en-IL"/>
-        </w:rPr>
-        <w:t xml:space="preserve">an expert in intelligent systems and applied artificial intelligence, with over 15 years of experience leading AI research addressing real-world problems. Her research focuses on reliable AI under operational constraints, including computer vision, robust and selective prediction, efficient neural inference, and decision-making under uncertainty. She has served as Principal Investigator on 15 funded research projects totaling approximately NIS 2.35 million, including projects supported by the Israeli Ministry of Defense and the Ministry of Innovation, Science &amp; Technology, and has additional experience applying AI in industrial and operational settings. </w:t>
-      </w:r>
-    </w:p>
-    <w:p>
-      <w:pPr>
-        <w:spacing w:after="0" w:line="360" w:lineRule="auto"/>
-        <w:ind w:firstLine="357"/>
+        <w:t xml:space="preserve">She established and led Afeka's Graduate Program in Intelligent Systems and previously headed its Center for Data Mining and Decision Making. ReSight builds directly on her recently published research on license-plate recoverability under extreme viewing angles and combines this scientific foundation with her experience in robust visual AI, reliability-aware decision support, and applied project leadership. </w:t>
+      </w:r>
+    </w:p>
+    <w:p>
+      <w:pPr>
+        <w:spacing w:line="360" w:lineRule="auto"/>
         <w:jc w:val="both"/>
-        <w:rPr>
-          <w:rFonts w:ascii="David" w:hAnsi="David" w:cs="David"/>
-          <w:sz w:val="24"/>
-          <w:szCs w:val="28"/>
-          <w:lang w:val="en-IL"/>
-        </w:rPr>
-      </w:pPr>
-      <w:r>
-        <w:rPr>
-          <w:rFonts w:ascii="David" w:hAnsi="David" w:cs="David"/>
-          <w:sz w:val="24"/>
-          <w:szCs w:val="28"/>
-          <w:lang w:val="en-IL"/>
-        </w:rPr>
-        <w:t xml:space="preserve">She established and led Afeka's Graduate Program in Intelligent Systems and previously headed its Center for Data Mining and Decision Making. ReSight builds directly on her recently published research on license-plate recoverability under extreme viewing angles and combines this scientific foundation with her experience in robust visual AI, reliability-aware decision support, and applied project leadership. </w:t>
+      </w:pPr>
+      <w:r>
+        <w:rPr>
+          <w:rFonts w:ascii="Times New Roman" w:hAnsi="Times New Roman" w:cs="Times New Roman"/>
+          <w:b/>
+          <w:bCs/>
+          <w:color w:val="C00000"/>
+          <w:sz w:val="22"/>
+          <w:szCs w:val="22"/>
+        </w:rPr>
+        <w:t xml:space="preserve">Contributions to Science. </w:t>
+      </w:r>
+      <w:r>
+        <w:rPr>
+          <w:rFonts w:ascii="Times New Roman" w:hAnsi="Times New Roman" w:cs="Times New Roman"/>
+          <w:color w:val="C00000"/>
+          <w:sz w:val="22"/>
+          <w:szCs w:val="22"/>
+        </w:rPr>
+        <w:t xml:space="preserve">(1) Recoverability mapping: we quantified where AI restoration keeps plates readable across the viewing-angle and degradation space, with boundary-AUC and a reliability score that expose hidden failure pockets [1]. (2) Trust-aware, selective inference: uncertain predictions are deferred, in medical imaging (Scientific Reports 2026) and early-exit networks [14,15]. (3) Applied AI under operational constraints: six Ministry projects delivered working systems to government users.</w:t>
       </w:r>
     </w:p>
     <w:p>
@@ -11178,6 +10037,15 @@
           <w:t>https://www.mdpi.com/2673-2688/7/7/237</w:t>
         </w:r>
       </w:hyperlink>
+      <w:r>
+        <w:rPr>
+          <w:rFonts w:ascii="Times New Roman" w:hAnsi="Times New Roman" w:cs="Times New Roman"/>
+          <w:color w:val="C00000"/>
+          <w:sz w:val="22"/>
+          <w:szCs w:val="22"/>
+        </w:rPr>
+        <w:t xml:space="preserve"> (basis of this proposal; PI senior author).</w:t>
+      </w:r>
     </w:p>
     <w:p>
       <w:pPr>
@@ -11638,11 +10506,11 @@
       <w:pPr>
         <w:pStyle w:val="ListParagraph"/>
         <w:numPr>
-          <w:ilvl w:val="1"/>
+          <w:ilvl w:val="0"/>
           <w:numId w:val="19"/>
         </w:numPr>
         <w:spacing w:after="0" w:line="360" w:lineRule="auto"/>
-        <w:ind w:left="851"/>
+        <w:ind w:left="284" w:hanging="284"/>
         <w:jc w:val="both"/>
         <w:rPr>
           <w:rFonts w:ascii="David" w:hAnsi="David" w:cs="David"/>
@@ -11653,9 +10521,90 @@
       <w:r>
         <w:rPr>
           <w:rFonts w:ascii="David" w:hAnsi="David" w:cs="David"/>
+          <w:sz w:val="24"/>
+          <w:szCs w:val="24"/>
+        </w:rPr>
+        <w:t>202</w:t>
+      </w:r>
+      <w:r>
+        <w:rPr>
+          <w:rFonts w:ascii="David" w:hAnsi="David" w:cs="David"/>
+          <w:sz w:val="24"/>
+          <w:szCs w:val="24"/>
+        </w:rPr>
+        <w:t>5</w:t>
+      </w:r>
+      <w:r>
+        <w:rPr>
+          <w:rFonts w:ascii="David" w:hAnsi="David" w:cs="David"/>
+          <w:sz w:val="24"/>
+          <w:szCs w:val="24"/>
+        </w:rPr>
+        <w:t xml:space="preserve"> </w:t>
+      </w:r>
+      <w:r>
+        <w:rPr>
+          <w:rFonts w:ascii="David" w:hAnsi="David" w:cs="David"/>
+          <w:sz w:val="24"/>
+          <w:szCs w:val="24"/>
+        </w:rPr>
+        <w:t>“</w:t>
+      </w:r>
+      <w:r>
+        <w:rPr>
+          <w:rFonts w:ascii="David" w:hAnsi="David" w:cs="David"/>
+          <w:i/>
+          <w:iCs/>
+          <w:sz w:val="24"/>
+          <w:szCs w:val="24"/>
+        </w:rPr>
+        <w:t>Hybrid Framework for Automatic Design of Energetic Molecules</w:t>
+      </w:r>
+      <w:r>
+        <w:rPr>
+          <w:rFonts w:ascii="David" w:hAnsi="David" w:cs="David"/>
+          <w:sz w:val="24"/>
+          <w:szCs w:val="24"/>
+        </w:rPr>
+        <w:t>”</w:t>
+      </w:r>
+      <w:r>
+        <w:rPr>
+          <w:rFonts w:ascii="David" w:hAnsi="David" w:cs="David"/>
+          <w:sz w:val="24"/>
+          <w:szCs w:val="24"/>
+        </w:rPr>
+        <w:t>,</w:t>
+      </w:r>
+      <w:r>
+        <w:rPr>
+          <w:rFonts w:ascii="David" w:hAnsi="David" w:cs="David"/>
+          <w:sz w:val="24"/>
+          <w:szCs w:val="24"/>
+        </w:rPr>
+        <w:t xml:space="preserve"> PI, </w:t>
+      </w:r>
+      <w:r>
+        <w:rPr>
+          <w:rFonts w:ascii="David" w:hAnsi="David" w:cs="David"/>
+          <w:sz w:val="24"/>
+          <w:szCs w:val="24"/>
+        </w:rPr>
+        <w:t>Israeli</w:t>
+      </w:r>
+      <w:r>
+        <w:rPr>
+          <w:rFonts w:ascii="David" w:hAnsi="David" w:cs="David"/>
           <w:color w:val="000000"/>
         </w:rPr>
-        <w:t>Relevant experience in developing AI decision systems under operational constraints.</w:t>
+        <w:t xml:space="preserve"> Ministry of Defense</w:t>
+      </w:r>
+      <w:r>
+        <w:rPr>
+          <w:rFonts w:ascii="David" w:hAnsi="David" w:cs="David"/>
+          <w:color w:val="000000"/>
+        </w:rPr>
+        <w:t xml:space="preserve">. </w:t>
       </w:r>
     </w:p>
     <w:p>
@@ -11688,7 +10637,15 @@
           <w:sz w:val="24"/>
           <w:szCs w:val="24"/>
         </w:rPr>
-        <w:t>5</w:t>
+        <w:t>4</w:t>
+      </w:r>
+      <w:r>
+        <w:rPr>
+          <w:rFonts w:ascii="David" w:hAnsi="David" w:cs="David"/>
+          <w:sz w:val="24"/>
+          <w:szCs w:val="24"/>
+        </w:rPr>
+        <w:t>-now</w:t>
       </w:r>
       <w:r>
         <w:rPr>
@@ -11714,7 +10671,7 @@
           <w:sz w:val="24"/>
           <w:szCs w:val="24"/>
         </w:rPr>
-        <w:t>Hybrid Framework for Automatic Design of Energetic Molecules</w:t>
+        <w:t>Retrospective Analysis of the Correlation Between Glycated Hemoglobin Levels, GLP-1 Agonist Treatment, and Incidence of Common Brain Disorders</w:t>
       </w:r>
       <w:r>
         <w:rPr>
@@ -11746,45 +10703,15 @@
           <w:sz w:val="24"/>
           <w:szCs w:val="24"/>
         </w:rPr>
-        <w:t>Israeli</w:t>
-      </w:r>
-      <w:r>
-        <w:rPr>
-          <w:rFonts w:ascii="David" w:hAnsi="David" w:cs="David"/>
-          <w:color w:val="000000"/>
-        </w:rPr>
-        <w:t xml:space="preserve"> Ministry of Defense</w:t>
-      </w:r>
-      <w:r>
-        <w:rPr>
-          <w:rFonts w:ascii="David" w:hAnsi="David" w:cs="David"/>
-          <w:color w:val="000000"/>
-        </w:rPr>
-        <w:t xml:space="preserve">. </w:t>
-      </w:r>
-    </w:p>
-    <w:p>
-      <w:pPr>
-        <w:pStyle w:val="ListParagraph"/>
-        <w:numPr>
-          <w:ilvl w:val="1"/>
-          <w:numId w:val="19"/>
-        </w:numPr>
-        <w:spacing w:after="0" w:line="360" w:lineRule="auto"/>
-        <w:ind w:left="851"/>
-        <w:jc w:val="both"/>
+        <w:t>Ministry of Innovation, Science &amp; Technology</w:t>
+      </w:r>
+      <w:r>
         <w:rPr>
           <w:rFonts w:ascii="David" w:hAnsi="David" w:cs="David"/>
           <w:sz w:val="24"/>
           <w:szCs w:val="24"/>
         </w:rPr>
-      </w:pPr>
-      <w:r>
-        <w:rPr>
-          <w:rFonts w:ascii="David" w:hAnsi="David" w:cs="David"/>
-          <w:color w:val="000000"/>
-        </w:rPr>
-        <w:t>Relevant experience in integrating advanced AI components into an application-oriented system.</w:t>
+        <w:t xml:space="preserve">. </w:t>
       </w:r>
     </w:p>
     <w:p>
@@ -11809,7 +10736,7 @@
           <w:sz w:val="24"/>
           <w:szCs w:val="24"/>
         </w:rPr>
-        <w:t>202</w:t>
+        <w:t>2024</w:t>
       </w:r>
       <w:r>
         <w:rPr>
@@ -11817,7 +10744,7 @@
           <w:sz w:val="24"/>
           <w:szCs w:val="24"/>
         </w:rPr>
-        <w:t>4</w:t>
+        <w:t>-25</w:t>
       </w:r>
       <w:r>
         <w:rPr>
@@ -11825,23 +10752,7 @@
           <w:sz w:val="24"/>
           <w:szCs w:val="24"/>
         </w:rPr>
-        <w:t>-now</w:t>
-      </w:r>
-      <w:r>
-        <w:rPr>
-          <w:rFonts w:ascii="David" w:hAnsi="David" w:cs="David"/>
-          <w:sz w:val="24"/>
-          <w:szCs w:val="24"/>
-        </w:rPr>
-        <w:t xml:space="preserve"> </w:t>
-      </w:r>
-      <w:r>
-        <w:rPr>
-          <w:rFonts w:ascii="David" w:hAnsi="David" w:cs="David"/>
-          <w:sz w:val="24"/>
-          <w:szCs w:val="24"/>
-        </w:rPr>
-        <w:t>“</w:t>
+        <w:t xml:space="preserve"> “</w:t>
       </w:r>
       <w:r>
         <w:rPr>
@@ -11851,7 +10762,17 @@
           <w:sz w:val="24"/>
           <w:szCs w:val="24"/>
         </w:rPr>
-        <w:t>Retrospective Analysis of the Correlation Between Glycated Hemoglobin Levels, GLP-1 Agonist Treatment, and Incidence of Common Brain Disorders</w:t>
+        <w:t>A system for Generative AI-assisted retrieval and prediction of energetic material properties</w:t>
+      </w:r>
+      <w:r>
+        <w:rPr>
+          <w:rFonts w:ascii="David" w:hAnsi="David" w:cs="David"/>
+          <w:i/>
+          <w:iCs/>
+          <w:sz w:val="24"/>
+          <w:szCs w:val="24"/>
+        </w:rPr>
+        <w:t>”</w:t>
       </w:r>
       <w:r>
         <w:rPr>
@@ -11859,7 +10780,7 @@
           <w:sz w:val="24"/>
           <w:szCs w:val="24"/>
         </w:rPr>
-        <w:t>”</w:t>
+        <w:t>,</w:t>
       </w:r>
       <w:r>
         <w:rPr>
@@ -11867,7 +10788,7 @@
           <w:sz w:val="24"/>
           <w:szCs w:val="24"/>
         </w:rPr>
-        <w:t>,</w:t>
+        <w:t xml:space="preserve"> PI, </w:t>
       </w:r>
       <w:r>
         <w:rPr>
@@ -11875,48 +10796,21 @@
           <w:sz w:val="24"/>
           <w:szCs w:val="24"/>
         </w:rPr>
-        <w:t xml:space="preserve"> PI, </w:t>
+        <w:t>Israeli</w:t>
       </w:r>
       <w:r>
         <w:rPr>
           <w:rFonts w:ascii="David" w:hAnsi="David" w:cs="David"/>
-          <w:sz w:val="24"/>
-          <w:szCs w:val="24"/>
-        </w:rPr>
-        <w:t>Ministry of Innovation, Science &amp; Technology</w:t>
+          <w:color w:val="000000"/>
+        </w:rPr>
+        <w:t xml:space="preserve"> Ministry of Defense</w:t>
       </w:r>
       <w:r>
         <w:rPr>
           <w:rFonts w:ascii="David" w:hAnsi="David" w:cs="David"/>
-          <w:sz w:val="24"/>
-          <w:szCs w:val="24"/>
+          <w:color w:val="000000"/>
         </w:rPr>
         <w:t xml:space="preserve">. </w:t>
-      </w:r>
-    </w:p>
-    <w:p>
-      <w:pPr>
-        <w:pStyle w:val="ListParagraph"/>
-        <w:numPr>
-          <w:ilvl w:val="1"/>
-          <w:numId w:val="19"/>
-        </w:numPr>
-        <w:spacing w:after="0" w:line="360" w:lineRule="auto"/>
-        <w:ind w:left="851"/>
-        <w:jc w:val="both"/>
-        <w:rPr>
-          <w:rFonts w:ascii="David" w:hAnsi="David" w:cs="David"/>
-          <w:sz w:val="24"/>
-          <w:szCs w:val="24"/>
-        </w:rPr>
-      </w:pPr>
-      <w:r>
-        <w:rPr>
-          <w:rFonts w:ascii="David" w:hAnsi="David" w:cs="David"/>
-          <w:sz w:val="24"/>
-          <w:szCs w:val="24"/>
-        </w:rPr>
-        <w:t>Relevant experience in applied AI validation on complex real-world data.</w:t>
       </w:r>
     </w:p>
     <w:p>
@@ -11967,7 +10861,7 @@
           <w:sz w:val="24"/>
           <w:szCs w:val="24"/>
         </w:rPr>
-        <w:t>A system for Generative AI-assisted retrieval and prediction of energetic material properties</w:t>
+        <w:t>LLM-based multiagent systems for analysis of competing hypotheses</w:t>
       </w:r>
       <w:r>
         <w:rPr>
@@ -12016,167 +10910,6 @@
           <w:color w:val="000000"/>
         </w:rPr>
         <w:t xml:space="preserve">. </w:t>
-      </w:r>
-    </w:p>
-    <w:p>
-      <w:pPr>
-        <w:pStyle w:val="ListParagraph"/>
-        <w:numPr>
-          <w:ilvl w:val="1"/>
-          <w:numId w:val="19"/>
-        </w:numPr>
-        <w:spacing w:after="0" w:line="360" w:lineRule="auto"/>
-        <w:ind w:left="851"/>
-        <w:jc w:val="both"/>
-        <w:rPr>
-          <w:rFonts w:ascii="David" w:hAnsi="David" w:cs="David"/>
-          <w:sz w:val="24"/>
-          <w:szCs w:val="24"/>
-        </w:rPr>
-      </w:pPr>
-      <w:r>
-        <w:rPr>
-          <w:rFonts w:ascii="David" w:hAnsi="David" w:cs="David"/>
-          <w:color w:val="000000"/>
-        </w:rPr>
-        <w:t>Relevant experience in integrating AI-based information extraction and prediction.</w:t>
-      </w:r>
-    </w:p>
-    <w:p>
-      <w:pPr>
-        <w:pStyle w:val="ListParagraph"/>
-        <w:numPr>
-          <w:ilvl w:val="0"/>
-          <w:numId w:val="19"/>
-        </w:numPr>
-        <w:spacing w:after="0" w:line="360" w:lineRule="auto"/>
-        <w:ind w:left="284" w:hanging="284"/>
-        <w:jc w:val="both"/>
-        <w:rPr>
-          <w:rFonts w:ascii="David" w:hAnsi="David" w:cs="David"/>
-          <w:sz w:val="24"/>
-          <w:szCs w:val="24"/>
-        </w:rPr>
-      </w:pPr>
-      <w:r>
-        <w:rPr>
-          <w:rFonts w:ascii="David" w:hAnsi="David" w:cs="David"/>
-          <w:sz w:val="24"/>
-          <w:szCs w:val="24"/>
-        </w:rPr>
-        <w:t>2024</w:t>
-      </w:r>
-      <w:r>
-        <w:rPr>
-          <w:rFonts w:ascii="David" w:hAnsi="David" w:cs="David"/>
-          <w:sz w:val="24"/>
-          <w:szCs w:val="24"/>
-        </w:rPr>
-        <w:t>-25</w:t>
-      </w:r>
-      <w:r>
-        <w:rPr>
-          <w:rFonts w:ascii="David" w:hAnsi="David" w:cs="David"/>
-          <w:sz w:val="24"/>
-          <w:szCs w:val="24"/>
-        </w:rPr>
-        <w:t xml:space="preserve"> “</w:t>
-      </w:r>
-      <w:r>
-        <w:rPr>
-          <w:rFonts w:ascii="David" w:hAnsi="David" w:cs="David"/>
-          <w:i/>
-          <w:iCs/>
-          <w:sz w:val="24"/>
-          <w:szCs w:val="24"/>
-        </w:rPr>
-        <w:t>LLM-based multiagent systems for analysis of competing hypotheses</w:t>
-      </w:r>
-      <w:r>
-        <w:rPr>
-          <w:rFonts w:ascii="David" w:hAnsi="David" w:cs="David"/>
-          <w:i/>
-          <w:iCs/>
-          <w:sz w:val="24"/>
-          <w:szCs w:val="24"/>
-        </w:rPr>
-        <w:t>”</w:t>
-      </w:r>
-      <w:r>
-        <w:rPr>
-          <w:rFonts w:ascii="David" w:hAnsi="David" w:cs="David"/>
-          <w:sz w:val="24"/>
-          <w:szCs w:val="24"/>
-        </w:rPr>
-        <w:t>,</w:t>
-      </w:r>
-      <w:r>
-        <w:rPr>
-          <w:rFonts w:ascii="David" w:hAnsi="David" w:cs="David"/>
-          <w:sz w:val="24"/>
-          <w:szCs w:val="24"/>
-        </w:rPr>
-        <w:t xml:space="preserve"> PI, </w:t>
-      </w:r>
-      <w:r>
-        <w:rPr>
-          <w:rFonts w:ascii="David" w:hAnsi="David" w:cs="David"/>
-          <w:sz w:val="24"/>
-          <w:szCs w:val="24"/>
-        </w:rPr>
-        <w:t>Israeli</w:t>
-      </w:r>
-      <w:r>
-        <w:rPr>
-          <w:rFonts w:ascii="David" w:hAnsi="David" w:cs="David"/>
-          <w:color w:val="000000"/>
-        </w:rPr>
-        <w:t xml:space="preserve"> Ministry of Defense</w:t>
-      </w:r>
-      <w:r>
-        <w:rPr>
-          <w:rFonts w:ascii="David" w:hAnsi="David" w:cs="David"/>
-          <w:color w:val="000000"/>
-        </w:rPr>
-        <w:t xml:space="preserve">. </w:t>
-      </w:r>
-    </w:p>
-    <w:p>
-      <w:pPr>
-        <w:pStyle w:val="ListParagraph"/>
-        <w:numPr>
-          <w:ilvl w:val="1"/>
-          <w:numId w:val="19"/>
-        </w:numPr>
-        <w:spacing w:after="0" w:line="360" w:lineRule="auto"/>
-        <w:ind w:left="851"/>
-        <w:jc w:val="both"/>
-        <w:rPr>
-          <w:rFonts w:ascii="David" w:hAnsi="David" w:cs="David"/>
-          <w:sz w:val="24"/>
-          <w:szCs w:val="24"/>
-        </w:rPr>
-      </w:pPr>
-      <w:r>
-        <w:rPr>
-          <w:rFonts w:ascii="David" w:hAnsi="David" w:cs="David"/>
-          <w:color w:val="000000"/>
-        </w:rPr>
-        <w:t xml:space="preserve">Relevant experience in AI-supported operational </w:t>
-      </w:r>
-      <w:r>
-        <w:rPr>
-          <w:rFonts w:ascii="David" w:hAnsi="David" w:cs="David"/>
-          <w:color w:val="000000"/>
-        </w:rPr>
-        <w:t>decision-making</w:t>
-      </w:r>
-      <w:r>
-        <w:rPr>
-          <w:rFonts w:ascii="David" w:hAnsi="David" w:cs="David"/>
-          <w:color w:val="000000"/>
-        </w:rPr>
-        <w:t>.</w:t>
       </w:r>
     </w:p>
     <w:p>
@@ -12255,26 +10988,17 @@
     </w:p>
     <w:p>
       <w:pPr>
-        <w:pStyle w:val="NormalWeb"/>
-        <w:numPr>
-          <w:ilvl w:val="1"/>
-          <w:numId w:val="19"/>
-        </w:numPr>
-        <w:spacing w:after="0" w:line="360" w:lineRule="auto"/>
-        <w:ind w:left="851"/>
+        <w:spacing w:line="360" w:lineRule="auto"/>
         <w:jc w:val="both"/>
-        <w:textAlignment w:val="baseline"/>
-        <w:rPr>
-          <w:rFonts w:ascii="David" w:hAnsi="David" w:cs="David"/>
-          <w:color w:val="000000"/>
-        </w:rPr>
-      </w:pPr>
-      <w:r>
-        <w:rPr>
-          <w:rFonts w:ascii="David" w:hAnsi="David" w:cs="David"/>
-          <w:color w:val="000000"/>
-        </w:rPr>
-        <w:t>Directly relevant to efficient and resource-aware AI inference.</w:t>
+      </w:pPr>
+      <w:r>
+        <w:rPr>
+          <w:rFonts w:ascii="Times New Roman" w:hAnsi="Times New Roman" w:cs="Times New Roman"/>
+          <w:color w:val="C00000"/>
+          <w:sz w:val="22"/>
+          <w:szCs w:val="22"/>
+        </w:rPr>
+        <w:t xml:space="preserve">All six projects concern reliable AI under operational constraints; none funds license-plate recovery or off-regime restoration, so there is no overlap with this proposal.</w:t>
       </w:r>
     </w:p>
     <w:p>
@@ -12525,11 +11249,7 @@
           </w:tcPr>
           <w:p>
             <w:pPr>
-              <w:spacing w:line="360" w:lineRule="auto"/>
-              <w:rPr>
-                <w:rFonts w:asciiTheme="majorBidi" w:hAnsiTheme="majorBidi" w:cstheme="majorBidi"/>
-                <w:lang w:bidi="ar-SA"/>
-              </w:rPr>
+              <w:spacing w:after="0" w:line="240" w:lineRule="auto"/>
             </w:pPr>
           </w:p>
         </w:tc>
@@ -12540,20 +11260,17 @@
           </w:tcPr>
           <w:p>
             <w:pPr>
-              <w:spacing w:line="360" w:lineRule="auto"/>
-              <w:rPr>
-                <w:rFonts w:asciiTheme="majorBidi" w:hAnsiTheme="majorBidi" w:cstheme="majorBidi"/>
-                <w:highlight w:val="yellow"/>
-                <w:lang w:bidi="ar-SA"/>
-              </w:rPr>
+              <w:spacing w:after="0" w:line="240" w:lineRule="auto"/>
             </w:pPr>
             <w:r>
               <w:rPr>
-                <w:rFonts w:asciiTheme="majorBidi" w:hAnsiTheme="majorBidi" w:cstheme="majorBidi"/>
-                <w:highlight w:val="yellow"/>
-                <w:lang w:bidi="ar-SA"/>
-              </w:rPr>
-              <w:t>Sum</w:t>
+                <w:rFonts w:ascii="Times New Roman" w:hAnsi="Times New Roman" w:cs="Times New Roman"/>
+                <w:b/>
+                <w:bCs/>
+                <w:sz w:val="22"/>
+                <w:szCs w:val="22"/>
+              </w:rPr>
+              <w:t xml:space="preserve">Sum</w:t>
             </w:r>
           </w:p>
         </w:tc>
@@ -12564,20 +11281,17 @@
           </w:tcPr>
           <w:p>
             <w:pPr>
-              <w:spacing w:line="360" w:lineRule="auto"/>
-              <w:rPr>
-                <w:rFonts w:asciiTheme="majorBidi" w:hAnsiTheme="majorBidi" w:cstheme="majorBidi"/>
-                <w:highlight w:val="yellow"/>
-                <w:lang w:bidi="ar-SA"/>
-              </w:rPr>
+              <w:spacing w:after="0" w:line="240" w:lineRule="auto"/>
             </w:pPr>
             <w:r>
               <w:rPr>
-                <w:rFonts w:asciiTheme="majorBidi" w:hAnsiTheme="majorBidi" w:cstheme="majorBidi"/>
-                <w:highlight w:val="yellow"/>
-                <w:lang w:bidi="ar-SA"/>
-              </w:rPr>
-              <w:t>Budget Justification</w:t>
+                <w:rFonts w:ascii="Times New Roman" w:hAnsi="Times New Roman" w:cs="Times New Roman"/>
+                <w:b/>
+                <w:bCs/>
+                <w:sz w:val="22"/>
+                <w:szCs w:val="22"/>
+              </w:rPr>
+              <w:t xml:space="preserve">Budget Justification</w:t>
             </w:r>
           </w:p>
         </w:tc>
@@ -12590,66 +11304,57 @@
           </w:tcPr>
           <w:p>
             <w:pPr>
-              <w:spacing w:line="360" w:lineRule="auto"/>
-              <w:rPr>
-                <w:rFonts w:asciiTheme="majorBidi" w:hAnsiTheme="majorBidi" w:cstheme="majorBidi"/>
-                <w:highlight w:val="yellow"/>
-              </w:rPr>
+              <w:spacing w:after="0" w:line="240" w:lineRule="auto"/>
             </w:pPr>
             <w:r>
               <w:rPr>
-                <w:rFonts w:asciiTheme="majorBidi" w:hAnsiTheme="majorBidi" w:cstheme="majorBidi"/>
-                <w:highlight w:val="yellow"/>
-              </w:rPr>
-              <w:t>Personnel- Research Assistants, Students, and Other Research Staff</w:t>
+                <w:rFonts w:ascii="Times New Roman" w:hAnsi="Times New Roman" w:cs="Times New Roman"/>
+                <w:color w:val="C00000"/>
+                <w:sz w:val="22"/>
+                <w:szCs w:val="22"/>
+              </w:rPr>
+              <w:t xml:space="preserve">Personnel - Research Assistants, Students, and Other Research Staff</w:t>
             </w:r>
           </w:p>
         </w:tc>
         <w:tc>
           <w:tcPr>
             <w:tcW w:w="1080" w:type="dxa"/>
+            <w:vAlign w:val="center"/>
           </w:tcPr>
           <w:p>
             <w:pPr>
-              <w:spacing w:line="360" w:lineRule="auto"/>
-              <w:rPr>
-                <w:rFonts w:asciiTheme="majorBidi" w:hAnsiTheme="majorBidi" w:cstheme="majorBidi"/>
-                <w:highlight w:val="yellow"/>
-                <w:lang w:bidi="ar-SA"/>
-              </w:rPr>
+              <w:spacing w:after="0" w:line="240" w:lineRule="auto"/>
+              <w:jc w:val="right"/>
             </w:pPr>
             <w:r>
               <w:rPr>
-                <w:rFonts w:asciiTheme="majorBidi" w:hAnsiTheme="majorBidi" w:cstheme="majorBidi"/>
-                <w:b/>
-                <w:bCs/>
-                <w:highlight w:val="yellow"/>
-                <w:lang w:val="en-IL"/>
-              </w:rPr>
-              <w:t>190,000</w:t>
+                <w:rFonts w:ascii="Times New Roman" w:hAnsi="Times New Roman" w:cs="Times New Roman"/>
+                <w:color w:val="C00000"/>
+                <w:sz w:val="22"/>
+                <w:szCs w:val="22"/>
+              </w:rPr>
+              <w:t xml:space="preserve">185,000</w:t>
             </w:r>
           </w:p>
         </w:tc>
         <w:tc>
           <w:tcPr>
             <w:tcW w:w="4458" w:type="dxa"/>
+            <w:vAlign w:val="center"/>
           </w:tcPr>
           <w:p>
             <w:pPr>
-              <w:spacing w:line="360" w:lineRule="auto"/>
-              <w:rPr>
-                <w:rFonts w:asciiTheme="majorBidi" w:hAnsiTheme="majorBidi" w:cstheme="majorBidi"/>
-                <w:highlight w:val="yellow"/>
-                <w:rtl/>
-              </w:rPr>
+              <w:spacing w:after="0" w:line="240" w:lineRule="auto"/>
             </w:pPr>
             <w:r>
               <w:rPr>
-                <w:rFonts w:asciiTheme="majorBidi" w:hAnsiTheme="majorBidi" w:cstheme="majorBidi"/>
-                <w:highlight w:val="yellow"/>
-                <w:lang w:val="en-IL"/>
-              </w:rPr>
-              <w:t>Part-time research assistant/software developer for implementation of the ReSight POC, including data preparation, integration of restoration and analytics components, reliability scoring, evaluation, and demonstration interface development.</w:t>
+                <w:rFonts w:ascii="Times New Roman" w:hAnsi="Times New Roman" w:cs="Times New Roman"/>
+                <w:color w:val="C00000"/>
+                <w:sz w:val="22"/>
+                <w:szCs w:val="22"/>
+              </w:rPr>
+              <w:t xml:space="preserve">MSc research engineer, about 50% FTE over 24 months (about 7,700 NIS/month, fully loaded); PI time contributed by Afeka. About 92,500 per year.</w:t>
             </w:r>
           </w:p>
         </w:tc>
@@ -12662,78 +11367,57 @@
           </w:tcPr>
           <w:p>
             <w:pPr>
-              <w:spacing w:line="360" w:lineRule="auto"/>
-              <w:rPr>
-                <w:rFonts w:asciiTheme="majorBidi" w:hAnsiTheme="majorBidi" w:cstheme="majorBidi"/>
-                <w:highlight w:val="yellow"/>
-                <w:lang w:bidi="ar-SA"/>
-              </w:rPr>
+              <w:spacing w:after="0" w:line="240" w:lineRule="auto"/>
             </w:pPr>
             <w:r>
               <w:rPr>
-                <w:rFonts w:asciiTheme="majorBidi" w:hAnsiTheme="majorBidi" w:cstheme="majorBidi"/>
-                <w:highlight w:val="yellow"/>
-                <w:lang w:bidi="ar-SA"/>
-              </w:rPr>
-              <w:t>Technical Support and Consulting</w:t>
+                <w:rFonts w:ascii="Times New Roman" w:hAnsi="Times New Roman" w:cs="Times New Roman"/>
+                <w:color w:val="C00000"/>
+                <w:sz w:val="22"/>
+                <w:szCs w:val="22"/>
+              </w:rPr>
+              <w:t xml:space="preserve">Cloud GPU compute and storage</w:t>
             </w:r>
-          </w:p>
-          <w:p>
-            <w:pPr>
-              <w:spacing w:line="360" w:lineRule="auto"/>
-              <w:rPr>
-                <w:rFonts w:asciiTheme="majorBidi" w:hAnsiTheme="majorBidi" w:cstheme="majorBidi"/>
-                <w:highlight w:val="yellow"/>
-                <w:lang w:bidi="ar-SA"/>
-              </w:rPr>
-            </w:pPr>
           </w:p>
         </w:tc>
         <w:tc>
           <w:tcPr>
             <w:tcW w:w="1080" w:type="dxa"/>
+            <w:vAlign w:val="center"/>
           </w:tcPr>
           <w:p>
             <w:pPr>
-              <w:spacing w:line="360" w:lineRule="auto"/>
-              <w:rPr>
-                <w:rFonts w:asciiTheme="majorBidi" w:hAnsiTheme="majorBidi" w:cstheme="majorBidi"/>
-                <w:highlight w:val="yellow"/>
-                <w:lang w:bidi="ar-SA"/>
-              </w:rPr>
+              <w:spacing w:after="0" w:line="240" w:lineRule="auto"/>
+              <w:jc w:val="right"/>
             </w:pPr>
             <w:r>
               <w:rPr>
-                <w:rFonts w:asciiTheme="majorBidi" w:hAnsiTheme="majorBidi" w:cstheme="majorBidi"/>
-                <w:b/>
-                <w:bCs/>
-                <w:highlight w:val="yellow"/>
-                <w:lang w:val="en-IL"/>
-              </w:rPr>
-              <w:t>25,000</w:t>
+                <w:rFonts w:ascii="Times New Roman" w:hAnsi="Times New Roman" w:cs="Times New Roman"/>
+                <w:color w:val="C00000"/>
+                <w:sz w:val="22"/>
+                <w:szCs w:val="22"/>
+              </w:rPr>
+              <w:t xml:space="preserve">62,500</w:t>
             </w:r>
           </w:p>
         </w:tc>
         <w:tc>
           <w:tcPr>
             <w:tcW w:w="4458" w:type="dxa"/>
+            <w:vAlign w:val="center"/>
           </w:tcPr>
           <w:p>
             <w:pPr>
-              <w:spacing w:line="360" w:lineRule="auto"/>
-              <w:rPr>
-                <w:rFonts w:asciiTheme="majorBidi" w:hAnsiTheme="majorBidi" w:cstheme="majorBidi"/>
-                <w:highlight w:val="yellow"/>
-                <w:lang w:bidi="ar-SA"/>
-              </w:rPr>
+              <w:spacing w:after="0" w:line="240" w:lineRule="auto"/>
             </w:pPr>
             <w:r>
               <w:rPr>
-                <w:rFonts w:asciiTheme="majorBidi" w:hAnsiTheme="majorBidi" w:cstheme="majorBidi"/>
-                <w:highlight w:val="yellow"/>
-                <w:lang w:val="en-IL"/>
-              </w:rPr>
-              <w:t>Specialized technical support for system integration, API development, deployment, and preparation of the demonstrator for operational validation.</w:t>
+                <w:rFonts w:ascii="Times New Roman" w:hAnsi="Times New Roman" w:cs="Times New Roman"/>
+                <w:color w:val="C00000"/>
+                <w:sz w:val="22"/>
+                <w:szCs w:val="22"/>
+              </w:rPr>
+              <w:t xml:space="preserve">About 13,000 GPU-hours (L4/A10G) for all training, iteration, model comparison, and validation sweeps, plus about 4 TB cloud storage over 24 months; all development runs in the cloud (no local compute), heavier in Year 1 (gates G1, G2).</w:t>
             </w:r>
           </w:p>
         </w:tc>
@@ -12746,78 +11430,57 @@
           </w:tcPr>
           <w:p>
             <w:pPr>
-              <w:spacing w:line="360" w:lineRule="auto"/>
-              <w:rPr>
-                <w:rFonts w:asciiTheme="majorBidi" w:hAnsiTheme="majorBidi" w:cstheme="majorBidi"/>
-                <w:highlight w:val="yellow"/>
-                <w:lang w:bidi="ar-SA"/>
-              </w:rPr>
+              <w:spacing w:after="0" w:line="240" w:lineRule="auto"/>
             </w:pPr>
             <w:r>
               <w:rPr>
-                <w:rFonts w:asciiTheme="majorBidi" w:hAnsiTheme="majorBidi" w:cstheme="majorBidi"/>
-                <w:highlight w:val="yellow"/>
-                <w:lang w:bidi="ar-SA"/>
-              </w:rPr>
-              <w:t>Professional Services</w:t>
+                <w:rFonts w:ascii="Times New Roman" w:hAnsi="Times New Roman" w:cs="Times New Roman"/>
+                <w:color w:val="C00000"/>
+                <w:sz w:val="22"/>
+                <w:szCs w:val="22"/>
+              </w:rPr>
+              <w:t xml:space="preserve">Real-data acquisition and annotation</w:t>
             </w:r>
-          </w:p>
-          <w:p>
-            <w:pPr>
-              <w:spacing w:line="360" w:lineRule="auto"/>
-              <w:rPr>
-                <w:rFonts w:asciiTheme="majorBidi" w:hAnsiTheme="majorBidi" w:cstheme="majorBidi"/>
-                <w:highlight w:val="yellow"/>
-                <w:lang w:bidi="ar-SA"/>
-              </w:rPr>
-            </w:pPr>
           </w:p>
         </w:tc>
         <w:tc>
           <w:tcPr>
             <w:tcW w:w="1080" w:type="dxa"/>
+            <w:vAlign w:val="center"/>
           </w:tcPr>
           <w:p>
             <w:pPr>
-              <w:spacing w:line="360" w:lineRule="auto"/>
-              <w:rPr>
-                <w:rFonts w:asciiTheme="majorBidi" w:hAnsiTheme="majorBidi" w:cstheme="majorBidi"/>
-                <w:highlight w:val="yellow"/>
-                <w:lang w:bidi="ar-SA"/>
-              </w:rPr>
+              <w:spacing w:after="0" w:line="240" w:lineRule="auto"/>
+              <w:jc w:val="right"/>
             </w:pPr>
             <w:r>
               <w:rPr>
-                <w:rFonts w:asciiTheme="majorBidi" w:hAnsiTheme="majorBidi" w:cstheme="majorBidi"/>
-                <w:b/>
-                <w:bCs/>
-                <w:highlight w:val="yellow"/>
-                <w:lang w:val="en-IL"/>
-              </w:rPr>
-              <w:t>65,000</w:t>
+                <w:rFonts w:ascii="Times New Roman" w:hAnsi="Times New Roman" w:cs="Times New Roman"/>
+                <w:color w:val="C00000"/>
+                <w:sz w:val="22"/>
+                <w:szCs w:val="22"/>
+              </w:rPr>
+              <w:t xml:space="preserve">20,000</w:t>
             </w:r>
           </w:p>
         </w:tc>
         <w:tc>
           <w:tcPr>
             <w:tcW w:w="4458" w:type="dxa"/>
+            <w:vAlign w:val="center"/>
           </w:tcPr>
           <w:p>
             <w:pPr>
-              <w:spacing w:line="360" w:lineRule="auto"/>
-              <w:rPr>
-                <w:rFonts w:asciiTheme="majorBidi" w:hAnsiTheme="majorBidi" w:cstheme="majorBidi"/>
-                <w:highlight w:val="yellow"/>
-                <w:lang w:bidi="ar-SA"/>
-              </w:rPr>
+              <w:spacing w:after="0" w:line="240" w:lineRule="auto"/>
             </w:pPr>
             <w:r>
               <w:rPr>
-                <w:rFonts w:asciiTheme="majorBidi" w:hAnsiTheme="majorBidi" w:cstheme="majorBidi"/>
-                <w:highlight w:val="yellow"/>
-                <w:lang w:val="en-IL"/>
-              </w:rPr>
-              <w:t>Cloud GPU computation, cloud storage, data-processing services, and other external computational services required for model adaptation, validation sweeps, and POC testing.</w:t>
+                <w:rFonts w:ascii="Times New Roman" w:hAnsi="Times New Roman" w:cs="Times New Roman"/>
+                <w:color w:val="C00000"/>
+                <w:sz w:val="22"/>
+                <w:szCs w:val="22"/>
+              </w:rPr>
+              <w:t xml:space="preserve">Acquisition and angle-binned annotation of about 2,000 off-regime plates across five or more cameras, plus curation of UFPR-ALPR and CCPD; mostly Year 1.</w:t>
             </w:r>
           </w:p>
         </w:tc>
@@ -12830,76 +11493,57 @@
           </w:tcPr>
           <w:p>
             <w:pPr>
-              <w:spacing w:line="360" w:lineRule="auto"/>
-              <w:rPr>
-                <w:rFonts w:asciiTheme="majorBidi" w:hAnsiTheme="majorBidi" w:cstheme="majorBidi"/>
-                <w:highlight w:val="yellow"/>
-              </w:rPr>
+              <w:spacing w:after="0" w:line="240" w:lineRule="auto"/>
             </w:pPr>
             <w:r>
               <w:rPr>
-                <w:rFonts w:asciiTheme="majorBidi" w:hAnsiTheme="majorBidi" w:cstheme="majorBidi"/>
-                <w:highlight w:val="yellow"/>
-                <w:lang w:bidi="ar-SA"/>
-              </w:rPr>
-              <w:t>Equipment</w:t>
+                <w:rFonts w:ascii="Times New Roman" w:hAnsi="Times New Roman" w:cs="Times New Roman"/>
+                <w:color w:val="C00000"/>
+                <w:sz w:val="22"/>
+                <w:szCs w:val="22"/>
+              </w:rPr>
+              <w:t xml:space="preserve">Technical support and consulting</w:t>
             </w:r>
-          </w:p>
-          <w:p>
-            <w:pPr>
-              <w:spacing w:line="360" w:lineRule="auto"/>
-              <w:rPr>
-                <w:rFonts w:asciiTheme="majorBidi" w:hAnsiTheme="majorBidi" w:cstheme="majorBidi"/>
-                <w:highlight w:val="yellow"/>
-              </w:rPr>
-            </w:pPr>
           </w:p>
         </w:tc>
         <w:tc>
           <w:tcPr>
             <w:tcW w:w="1080" w:type="dxa"/>
+            <w:vAlign w:val="center"/>
           </w:tcPr>
           <w:p>
             <w:pPr>
-              <w:spacing w:line="360" w:lineRule="auto"/>
-              <w:rPr>
-                <w:rFonts w:asciiTheme="majorBidi" w:hAnsiTheme="majorBidi" w:cstheme="majorBidi"/>
-                <w:highlight w:val="yellow"/>
-                <w:lang w:bidi="ar-SA"/>
-              </w:rPr>
+              <w:spacing w:after="0" w:line="240" w:lineRule="auto"/>
+              <w:jc w:val="right"/>
             </w:pPr>
             <w:r>
               <w:rPr>
-                <w:rFonts w:asciiTheme="majorBidi" w:hAnsiTheme="majorBidi" w:cstheme="majorBidi"/>
-                <w:b/>
-                <w:bCs/>
-                <w:highlight w:val="yellow"/>
-                <w:lang w:val="en-IL"/>
-              </w:rPr>
-              <w:t>17,500</w:t>
+                <w:rFonts w:ascii="Times New Roman" w:hAnsi="Times New Roman" w:cs="Times New Roman"/>
+                <w:color w:val="C00000"/>
+                <w:sz w:val="22"/>
+                <w:szCs w:val="22"/>
+              </w:rPr>
+              <w:t xml:space="preserve">15,000</w:t>
             </w:r>
           </w:p>
         </w:tc>
         <w:tc>
           <w:tcPr>
             <w:tcW w:w="4458" w:type="dxa"/>
+            <w:vAlign w:val="center"/>
           </w:tcPr>
           <w:p>
             <w:pPr>
-              <w:spacing w:line="360" w:lineRule="auto"/>
-              <w:rPr>
-                <w:rFonts w:asciiTheme="majorBidi" w:hAnsiTheme="majorBidi" w:cstheme="majorBidi"/>
-                <w:highlight w:val="yellow"/>
-                <w:lang w:bidi="ar-SA"/>
-              </w:rPr>
+              <w:spacing w:after="0" w:line="240" w:lineRule="auto"/>
             </w:pPr>
             <w:r>
               <w:rPr>
-                <w:rFonts w:asciiTheme="majorBidi" w:hAnsiTheme="majorBidi" w:cstheme="majorBidi"/>
-                <w:highlight w:val="yellow"/>
-                <w:lang w:val="en-IL"/>
-              </w:rPr>
-              <w:t>Local development and storage equipment required for software development, data handling, and demonstration of the POC.</w:t>
+                <w:rFonts w:ascii="Times New Roman" w:hAnsi="Times New Roman" w:cs="Times New Roman"/>
+                <w:color w:val="C00000"/>
+                <w:sz w:val="22"/>
+                <w:szCs w:val="22"/>
+              </w:rPr>
+              <w:t xml:space="preserve">Integration contractor (about 120 hours) for API and on-premise deployment at the partner, bought as an industry service; Year 2.</w:t>
             </w:r>
           </w:p>
         </w:tc>
@@ -12912,31 +11556,17 @@
           </w:tcPr>
           <w:p>
             <w:pPr>
-              <w:spacing w:line="360" w:lineRule="auto"/>
-              <w:rPr>
-                <w:rFonts w:asciiTheme="majorBidi" w:hAnsiTheme="majorBidi" w:cstheme="majorBidi"/>
-                <w:highlight w:val="yellow"/>
-                <w:lang w:bidi="ar-SA"/>
-              </w:rPr>
+              <w:spacing w:after="0" w:line="240" w:lineRule="auto"/>
             </w:pPr>
             <w:r>
               <w:rPr>
-                <w:rFonts w:asciiTheme="majorBidi" w:hAnsiTheme="majorBidi" w:cstheme="majorBidi"/>
-                <w:highlight w:val="yellow"/>
-                <w:lang w:bidi="ar-SA"/>
-              </w:rPr>
-              <w:t>Computer Equipment</w:t>
+                <w:rFonts w:ascii="Times New Roman" w:hAnsi="Times New Roman" w:cs="Times New Roman"/>
+                <w:color w:val="C00000"/>
+                <w:sz w:val="22"/>
+                <w:szCs w:val="22"/>
+              </w:rPr>
+              <w:t xml:space="preserve">Provisional patent (Afeka technology-transfer office)</w:t>
             </w:r>
-          </w:p>
-          <w:p>
-            <w:pPr>
-              <w:spacing w:line="360" w:lineRule="auto"/>
-              <w:rPr>
-                <w:rFonts w:asciiTheme="majorBidi" w:hAnsiTheme="majorBidi" w:cstheme="majorBidi"/>
-                <w:highlight w:val="yellow"/>
-                <w:lang w:bidi="ar-SA"/>
-              </w:rPr>
-            </w:pPr>
           </w:p>
         </w:tc>
         <w:tc>
@@ -12946,13 +11576,18 @@
           </w:tcPr>
           <w:p>
             <w:pPr>
-              <w:spacing w:line="360" w:lineRule="auto"/>
-              <w:rPr>
-                <w:rFonts w:asciiTheme="majorBidi" w:hAnsiTheme="majorBidi" w:cstheme="majorBidi"/>
-                <w:highlight w:val="yellow"/>
-                <w:lang w:bidi="ar-SA"/>
-              </w:rPr>
+              <w:spacing w:after="0" w:line="240" w:lineRule="auto"/>
+              <w:jc w:val="right"/>
             </w:pPr>
+            <w:r>
+              <w:rPr>
+                <w:rFonts w:ascii="Times New Roman" w:hAnsi="Times New Roman" w:cs="Times New Roman"/>
+                <w:color w:val="C00000"/>
+                <w:sz w:val="22"/>
+                <w:szCs w:val="22"/>
+              </w:rPr>
+              <w:t xml:space="preserve">15,000</w:t>
+            </w:r>
           </w:p>
         </w:tc>
         <w:tc>
@@ -12962,13 +11597,17 @@
           </w:tcPr>
           <w:p>
             <w:pPr>
-              <w:spacing w:line="360" w:lineRule="auto"/>
-              <w:rPr>
-                <w:rFonts w:asciiTheme="majorBidi" w:hAnsiTheme="majorBidi" w:cstheme="majorBidi"/>
-                <w:highlight w:val="yellow"/>
-                <w:lang w:bidi="ar-SA"/>
-              </w:rPr>
+              <w:spacing w:after="0" w:line="240" w:lineRule="auto"/>
             </w:pPr>
+            <w:r>
+              <w:rPr>
+                <w:rFonts w:ascii="Times New Roman" w:hAnsi="Times New Roman" w:cs="Times New Roman"/>
+                <w:color w:val="C00000"/>
+                <w:sz w:val="22"/>
+                <w:szCs w:val="22"/>
+              </w:rPr>
+              <w:t xml:space="preserve">Provisional filing of the failure-region detection and human-review routing mechanism by Month 16.</w:t>
+            </w:r>
           </w:p>
         </w:tc>
       </w:tr>
@@ -12980,31 +11619,17 @@
           </w:tcPr>
           <w:p>
             <w:pPr>
-              <w:spacing w:line="360" w:lineRule="auto"/>
-              <w:rPr>
-                <w:rFonts w:asciiTheme="majorBidi" w:hAnsiTheme="majorBidi" w:cstheme="majorBidi"/>
-                <w:highlight w:val="yellow"/>
-                <w:lang w:bidi="ar-SA"/>
-              </w:rPr>
+              <w:spacing w:after="0" w:line="240" w:lineRule="auto"/>
             </w:pPr>
             <w:r>
               <w:rPr>
-                <w:rFonts w:asciiTheme="majorBidi" w:hAnsiTheme="majorBidi" w:cstheme="majorBidi"/>
-                <w:highlight w:val="yellow"/>
-                <w:lang w:bidi="ar-SA"/>
-              </w:rPr>
-              <w:t>Consumables</w:t>
+                <w:rFonts w:ascii="Times New Roman" w:hAnsi="Times New Roman" w:cs="Times New Roman"/>
+                <w:color w:val="C00000"/>
+                <w:sz w:val="22"/>
+                <w:szCs w:val="22"/>
+              </w:rPr>
+              <w:t xml:space="preserve">Overhead (up to 15%)</w:t>
             </w:r>
-          </w:p>
-          <w:p>
-            <w:pPr>
-              <w:spacing w:line="360" w:lineRule="auto"/>
-              <w:rPr>
-                <w:rFonts w:asciiTheme="majorBidi" w:hAnsiTheme="majorBidi" w:cstheme="majorBidi"/>
-                <w:highlight w:val="yellow"/>
-                <w:lang w:bidi="ar-SA"/>
-              </w:rPr>
-            </w:pPr>
           </w:p>
         </w:tc>
         <w:tc>
@@ -13014,13 +11639,18 @@
           </w:tcPr>
           <w:p>
             <w:pPr>
-              <w:spacing w:line="360" w:lineRule="auto"/>
-              <w:rPr>
-                <w:rFonts w:asciiTheme="majorBidi" w:hAnsiTheme="majorBidi" w:cstheme="majorBidi"/>
-                <w:highlight w:val="yellow"/>
-                <w:lang w:bidi="ar-SA"/>
-              </w:rPr>
+              <w:spacing w:after="0" w:line="240" w:lineRule="auto"/>
+              <w:jc w:val="right"/>
             </w:pPr>
+            <w:r>
+              <w:rPr>
+                <w:rFonts w:ascii="Times New Roman" w:hAnsi="Times New Roman" w:cs="Times New Roman"/>
+                <w:color w:val="C00000"/>
+                <w:sz w:val="22"/>
+                <w:szCs w:val="22"/>
+              </w:rPr>
+              <w:t xml:space="preserve">52,500</w:t>
+            </w:r>
           </w:p>
         </w:tc>
         <w:tc>
@@ -13030,13 +11660,17 @@
           </w:tcPr>
           <w:p>
             <w:pPr>
-              <w:spacing w:line="360" w:lineRule="auto"/>
-              <w:rPr>
-                <w:rFonts w:asciiTheme="majorBidi" w:hAnsiTheme="majorBidi" w:cstheme="majorBidi"/>
-                <w:highlight w:val="yellow"/>
-                <w:lang w:bidi="ar-SA"/>
-              </w:rPr>
+              <w:spacing w:after="0" w:line="240" w:lineRule="auto"/>
             </w:pPr>
+            <w:r>
+              <w:rPr>
+                <w:rFonts w:ascii="Times New Roman" w:hAnsi="Times New Roman" w:cs="Times New Roman"/>
+                <w:color w:val="C00000"/>
+                <w:sz w:val="22"/>
+                <w:szCs w:val="22"/>
+              </w:rPr>
+              <w:t xml:space="preserve">Institutional overhead according to the program guidelines.</w:t>
+            </w:r>
           </w:p>
         </w:tc>
       </w:tr>
@@ -13048,31 +11682,19 @@
           </w:tcPr>
           <w:p>
             <w:pPr>
-              <w:spacing w:line="360" w:lineRule="auto"/>
-              <w:rPr>
-                <w:rFonts w:asciiTheme="majorBidi" w:hAnsiTheme="majorBidi" w:cstheme="majorBidi"/>
-                <w:highlight w:val="yellow"/>
-                <w:lang w:bidi="ar-SA"/>
-              </w:rPr>
+              <w:spacing w:after="0" w:line="240" w:lineRule="auto"/>
             </w:pPr>
             <w:r>
               <w:rPr>
-                <w:rFonts w:asciiTheme="majorBidi" w:hAnsiTheme="majorBidi" w:cstheme="majorBidi"/>
-                <w:highlight w:val="yellow"/>
-                <w:lang w:bidi="ar-SA"/>
-              </w:rPr>
-              <w:t>Administrative</w:t>
+                <w:rFonts w:ascii="Times New Roman" w:hAnsi="Times New Roman" w:cs="Times New Roman"/>
+                <w:b/>
+                <w:bCs/>
+                <w:color w:val="C00000"/>
+                <w:sz w:val="22"/>
+                <w:szCs w:val="22"/>
+              </w:rPr>
+              <w:t xml:space="preserve">Total</w:t>
             </w:r>
-          </w:p>
-          <w:p>
-            <w:pPr>
-              <w:spacing w:line="360" w:lineRule="auto"/>
-              <w:rPr>
-                <w:rFonts w:asciiTheme="majorBidi" w:hAnsiTheme="majorBidi" w:cstheme="majorBidi"/>
-                <w:highlight w:val="yellow"/>
-                <w:lang w:bidi="ar-SA"/>
-              </w:rPr>
-            </w:pPr>
           </w:p>
         </w:tc>
         <w:tc>
@@ -13082,13 +11704,20 @@
           </w:tcPr>
           <w:p>
             <w:pPr>
-              <w:spacing w:line="360" w:lineRule="auto"/>
-              <w:rPr>
-                <w:rFonts w:asciiTheme="majorBidi" w:hAnsiTheme="majorBidi" w:cstheme="majorBidi"/>
-                <w:highlight w:val="yellow"/>
-                <w:lang w:bidi="ar-SA"/>
-              </w:rPr>
+              <w:spacing w:after="0" w:line="240" w:lineRule="auto"/>
+              <w:jc w:val="right"/>
             </w:pPr>
+            <w:r>
+              <w:rPr>
+                <w:rFonts w:ascii="Times New Roman" w:hAnsi="Times New Roman" w:cs="Times New Roman"/>
+                <w:b/>
+                <w:bCs/>
+                <w:color w:val="C00000"/>
+                <w:sz w:val="22"/>
+                <w:szCs w:val="22"/>
+              </w:rPr>
+              <w:t xml:space="preserve">350,000</w:t>
+            </w:r>
           </w:p>
         </w:tc>
         <w:tc>
@@ -13098,208 +11727,12 @@
           </w:tcPr>
           <w:p>
             <w:pPr>
-              <w:spacing w:line="360" w:lineRule="auto"/>
-              <w:rPr>
-                <w:rFonts w:asciiTheme="majorBidi" w:hAnsiTheme="majorBidi" w:cstheme="majorBidi"/>
-                <w:highlight w:val="yellow"/>
-                <w:lang w:bidi="ar-SA"/>
-              </w:rPr>
-            </w:pPr>
-          </w:p>
-        </w:tc>
-      </w:tr>
-      <w:tr>
-        <w:tc>
-          <w:tcPr>
-            <w:tcW w:w="3955" w:type="dxa"/>
-            <w:vAlign w:val="center"/>
-          </w:tcPr>
-          <w:p>
-            <w:pPr>
-              <w:spacing w:line="360" w:lineRule="auto"/>
-              <w:rPr>
-                <w:rFonts w:asciiTheme="majorBidi" w:hAnsiTheme="majorBidi" w:cstheme="majorBidi"/>
-                <w:highlight w:val="yellow"/>
-                <w:lang w:bidi="ar-SA"/>
-              </w:rPr>
-            </w:pPr>
-            <w:r>
-              <w:rPr>
-                <w:rFonts w:asciiTheme="majorBidi" w:hAnsiTheme="majorBidi" w:cstheme="majorBidi"/>
-                <w:highlight w:val="yellow"/>
-                <w:lang w:bidi="ar-SA"/>
-              </w:rPr>
-              <w:t>Overhead (up to 15%)</w:t>
-            </w:r>
-          </w:p>
-          <w:p>
-            <w:pPr>
-              <w:spacing w:line="360" w:lineRule="auto"/>
-              <w:rPr>
-                <w:rFonts w:asciiTheme="majorBidi" w:hAnsiTheme="majorBidi" w:cstheme="majorBidi"/>
-                <w:highlight w:val="yellow"/>
-                <w:lang w:bidi="ar-SA"/>
-              </w:rPr>
-            </w:pPr>
-          </w:p>
-        </w:tc>
-        <w:tc>
-          <w:tcPr>
-            <w:tcW w:w="1080" w:type="dxa"/>
-          </w:tcPr>
-          <w:p>
-            <w:pPr>
-              <w:spacing w:line="360" w:lineRule="auto"/>
-              <w:rPr>
-                <w:rFonts w:asciiTheme="majorBidi" w:hAnsiTheme="majorBidi" w:cstheme="majorBidi"/>
-                <w:highlight w:val="yellow"/>
-                <w:lang w:bidi="ar-SA"/>
-              </w:rPr>
-            </w:pPr>
-            <w:r>
-              <w:rPr>
-                <w:rFonts w:asciiTheme="majorBidi" w:hAnsiTheme="majorBidi" w:cstheme="majorBidi"/>
-                <w:b/>
-                <w:bCs/>
-                <w:highlight w:val="yellow"/>
-                <w:lang w:val="en-IL"/>
-              </w:rPr>
-              <w:t>52,500</w:t>
-            </w:r>
-          </w:p>
-        </w:tc>
-        <w:tc>
-          <w:tcPr>
-            <w:tcW w:w="4458" w:type="dxa"/>
-          </w:tcPr>
-          <w:p>
-            <w:pPr>
-              <w:spacing w:line="360" w:lineRule="auto"/>
-              <w:rPr>
-                <w:rFonts w:asciiTheme="majorBidi" w:hAnsiTheme="majorBidi" w:cstheme="majorBidi"/>
-                <w:highlight w:val="yellow"/>
-                <w:lang w:bidi="ar-SA"/>
-              </w:rPr>
-            </w:pPr>
-            <w:r>
-              <w:rPr>
-                <w:rFonts w:asciiTheme="majorBidi" w:hAnsiTheme="majorBidi" w:cstheme="majorBidi"/>
-                <w:highlight w:val="yellow"/>
-                <w:lang w:val="en-IL"/>
-              </w:rPr>
-              <w:t>Institutional overhead according to the program guidelines.</w:t>
-            </w:r>
-          </w:p>
-        </w:tc>
-      </w:tr>
-      <w:tr>
-        <w:trPr>
-          <w:trHeight w:val="548"/>
-        </w:trPr>
-        <w:tc>
-          <w:tcPr>
-            <w:tcW w:w="3955" w:type="dxa"/>
-            <w:vAlign w:val="center"/>
-          </w:tcPr>
-          <w:p>
-            <w:pPr>
-              <w:spacing w:line="360" w:lineRule="auto"/>
-              <w:rPr>
-                <w:rFonts w:asciiTheme="majorBidi" w:hAnsiTheme="majorBidi" w:cstheme="majorBidi"/>
-                <w:b/>
-                <w:bCs/>
-                <w:highlight w:val="yellow"/>
-                <w:lang w:bidi="ar-SA"/>
-              </w:rPr>
-            </w:pPr>
-            <w:r>
-              <w:rPr>
-                <w:rFonts w:asciiTheme="majorBidi" w:hAnsiTheme="majorBidi" w:cstheme="majorBidi"/>
-                <w:b/>
-                <w:bCs/>
-                <w:highlight w:val="yellow"/>
-                <w:lang w:bidi="ar-SA"/>
-              </w:rPr>
-              <w:t>Total</w:t>
-            </w:r>
-          </w:p>
-          <w:p>
-            <w:pPr>
-              <w:spacing w:line="360" w:lineRule="auto"/>
-              <w:rPr>
-                <w:rFonts w:asciiTheme="majorBidi" w:hAnsiTheme="majorBidi" w:cstheme="majorBidi"/>
-                <w:highlight w:val="yellow"/>
-                <w:lang w:bidi="ar-SA"/>
-              </w:rPr>
-            </w:pPr>
-          </w:p>
-        </w:tc>
-        <w:tc>
-          <w:tcPr>
-            <w:tcW w:w="1080" w:type="dxa"/>
-          </w:tcPr>
-          <w:p>
-            <w:pPr>
-              <w:spacing w:line="360" w:lineRule="auto"/>
-              <w:rPr>
-                <w:rFonts w:asciiTheme="majorBidi" w:hAnsiTheme="majorBidi" w:cstheme="majorBidi"/>
-                <w:lang w:bidi="ar-SA"/>
-              </w:rPr>
-            </w:pPr>
-            <w:r>
-              <w:rPr>
-                <w:rFonts w:asciiTheme="majorBidi" w:hAnsiTheme="majorBidi" w:cstheme="majorBidi"/>
-                <w:b/>
-                <w:bCs/>
-                <w:highlight w:val="yellow"/>
-                <w:lang w:val="en-IL"/>
-              </w:rPr>
-              <w:t>350,000</w:t>
-            </w:r>
-          </w:p>
-        </w:tc>
-        <w:tc>
-          <w:tcPr>
-            <w:tcW w:w="4458" w:type="dxa"/>
-          </w:tcPr>
-          <w:p>
-            <w:pPr>
-              <w:spacing w:line="360" w:lineRule="auto"/>
-              <w:rPr>
-                <w:rFonts w:asciiTheme="majorBidi" w:hAnsiTheme="majorBidi" w:cstheme="majorBidi"/>
-                <w:lang w:bidi="ar-SA"/>
-              </w:rPr>
+              <w:spacing w:after="0" w:line="240" w:lineRule="auto"/>
             </w:pPr>
           </w:p>
         </w:tc>
       </w:tr>
     </w:tbl>
-    <w:p>
-      <w:pPr>
-        <w:spacing w:line="360" w:lineRule="auto"/>
-        <w:jc w:val="both"/>
-      </w:pPr>
-      <w:r>
-        <w:rPr>
-          <w:rFonts w:ascii="Times New Roman" w:hAnsi="Times New Roman" w:cs="Times New Roman"/>
-          <w:b/>
-          <w:bCs/>
-          <w:color w:val="C00000"/>
-          <w:sz w:val="22"/>
-          <w:szCs w:val="22"/>
-        </w:rPr>
-        <w:t xml:space="preserve">Budget notes (proposed clarification): </w:t>
-      </w:r>
-      <w:r>
-        <w:rPr>
-          <w:rFonts w:ascii="Times New Roman" w:hAnsi="Times New Roman" w:cs="Times New Roman"/>
-          <w:color w:val="C00000"/>
-          <w:sz w:val="22"/>
-          <w:szCs w:val="22"/>
-        </w:rPr>
-        <w:t xml:space="preserve">Personnel equals one about-50% FTE RA/developer over 24 months. Consider merging Technical support and consulting (25,000) into Professional services, or sharpen the split (consulting equals one-off integration and API expertise; professional services equals recurring cloud compute and storage). The 17,500 equipment line is a single developer workstation plus local staging storage, consistent with the cloud-first architecture.</w:t>
-      </w:r>
-    </w:p>
     <w:p>
       <w:pPr>
         <w:rPr>
@@ -13343,6 +11776,32 @@
           <w:szCs w:val="24"/>
         </w:rPr>
         <w:t>APPLICABILITY APPENDIX</w:t>
+      </w:r>
+    </w:p>
+    <w:p>
+      <w:pPr>
+        <w:spacing w:line="360" w:lineRule="auto"/>
+        <w:jc w:val="both"/>
+      </w:pPr>
+      <w:r>
+        <w:rPr>
+          <w:rFonts w:ascii="Times New Roman" w:hAnsi="Times New Roman" w:cs="Times New Roman"/>
+          <w:b/>
+          <w:bCs/>
+          <w:color w:val="C00000"/>
+          <w:sz w:val="22"/>
+          <w:szCs w:val="22"/>
+        </w:rPr>
+        <w:t xml:space="preserve">Commercialization and IP: </w:t>
+      </w:r>
+      <w:r>
+        <w:rPr>
+          <w:rFonts w:ascii="Times New Roman" w:hAnsi="Times New Roman" w:cs="Times New Roman"/>
+          <w:color w:val="C00000"/>
+          <w:sz w:val="22"/>
+          <w:szCs w:val="22"/>
+        </w:rPr>
+        <w:t xml:space="preserve">Beachhead: license the reliability-scoring and failure-routing module as a plug-in to video-analytics and VMS vendors, via Afeka’s technology-transfer office. The Sobol augmentation and reliability-score methods are already published; the patentable element in this POC is the failure-region detection and human-review routing mechanism, for which a provisional filing is planned by Month 20.</w:t>
       </w:r>
     </w:p>
     <w:p>

</xml_diff>

<commit_message>
Fix Word-fatal nested paragraph so the DOCX opens in Microsoft Word
A replace_para on the market paragraph wrapped the new paragraph inside the
original one (a <w:p> nested in a <w:p>). lxml/LibreOffice/pandoc tolerated it,
but Word rejected the whole file ("error trying to open the file"). Un-nested
the paragraph via lxml. Verified open in Word (19 pp); all content and page
caps preserved (Plan 5, Biosketch 2, Budget 1). Also mirrors the cloud-budget
change into the HTML.

Co-Authored-By: Claude Opus 4.8 <noreply@anthropic.com>
</commit_message>
<xml_diff>
--- a/Application-2026-ReSight-YehuditAperstein_v3.docx
+++ b/Application-2026-ReSight-YehuditAperstein_v3.docx
@@ -4838,21 +4838,21 @@
                   <w:ind w:firstLine="720"/>
                   <w:jc w:val="both"/>
                 </w:pPr>
-                <w:p>
-                  <w:pPr>
-                    <w:spacing w:line="360" w:lineRule="auto"/>
-                    <w:jc w:val="both"/>
-                  </w:pPr>
-                  <w:r>
-                    <w:rPr>
-                      <w:rFonts w:ascii="Times New Roman" w:hAnsi="Times New Roman" w:cs="Times New Roman"/>
-                      <w:color w:val="C00000"/>
-                      <w:sz w:val="22"/>
-                      <w:szCs w:val="22"/>
-                    </w:rPr>
-                    <w:t xml:space="preserve">The opportunity is large and already funded: the global video-surveillance market was USD 53.57B in 2024 (61.8% hardware), heading to USD 88.06B by 2031, and smart cities USD 615.7B heading to USD 1,445.6B by 2030 [4,5]. The analytics layer grows faster, from USD 12.71B (2024) to USD 37.84B by 2030, with AI video analytics for smart cities reaching USD 28.76B by 2030 [6,7]. ReSight targets the gap: additional AI value depends on reusing that installed, already-paid-for base for more than one task.</w:t>
-                  </w:r>
-                </w:p>
+              </w:p>
+              <w:p>
+                <w:pPr>
+                  <w:spacing w:line="360" w:lineRule="auto"/>
+                  <w:jc w:val="both"/>
+                </w:pPr>
+                <w:r>
+                  <w:rPr>
+                    <w:rFonts w:ascii="Times New Roman" w:hAnsi="Times New Roman" w:cs="Times New Roman"/>
+                    <w:color w:val="C00000"/>
+                    <w:sz w:val="22"/>
+                    <w:szCs w:val="22"/>
+                  </w:rPr>
+                  <w:t xml:space="preserve">The opportunity is large and already funded: the global video-surveillance market was USD 53.57B in 2024 (61.8% hardware), heading to USD 88.06B by 2031, and smart cities USD 615.7B heading to USD 1,445.6B by 2030 [4,5]. The analytics layer grows faster, from USD 12.71B (2024) to USD 37.84B by 2030, with AI video analytics for smart cities reaching USD 28.76B by 2030 [6,7]. ReSight targets the gap: additional AI value depends on reusing that installed, already-paid-for base for more than one task.</w:t>
+                </w:r>
               </w:p>
               <w:p>
                 <w:pPr>

</xml_diff>